<commit_message>
New context survey done
</commit_message>
<xml_diff>
--- a/dissertation.docx
+++ b/dissertation.docx
@@ -3368,14 +3368,7 @@
           <w:color w:val="auto"/>
           <w:lang w:val="en-GB"/>
         </w:rPr>
-        <w:t xml:space="preserve">Synthetic Population </w:t>
-      </w:r>
-      <w:r>
-        <w:rPr>
-          <w:color w:val="auto"/>
-          <w:lang w:val="en-GB"/>
-        </w:rPr>
-        <w:t>Generation</w:t>
+        <w:t>Synthetic Population Generation</w:t>
       </w:r>
     </w:p>
     <w:p>
@@ -3766,7 +3759,19 @@
         <w:rPr>
           <w:lang w:val="en-GB"/>
         </w:rPr>
-        <w:t>ValiPop is a program for simulating synthetic</w:t>
+        <w:t xml:space="preserve">ValiPop </w:t>
+      </w:r>
+      <w:r>
+        <w:rPr>
+          <w:lang w:val="en-GB"/>
+        </w:rPr>
+        <w:t>was</w:t>
+      </w:r>
+      <w:r>
+        <w:rPr>
+          <w:lang w:val="en-GB"/>
+        </w:rPr>
+        <w:t xml:space="preserve"> a program for simulating synthetic</w:t>
       </w:r>
       <w:r>
         <w:rPr>
@@ -3790,13 +3795,49 @@
         <w:rPr>
           <w:lang w:val="en-GB"/>
         </w:rPr>
-        <w:t xml:space="preserve"> desired statistics. It also validates that the simulated population conforms to the desired statistics </w:t>
-      </w:r>
-      <w:r>
-        <w:rPr>
-          <w:lang w:val="en-GB"/>
-        </w:rPr>
-        <w:t>through statistical analysis. The resulting population is written out as a series of</w:t>
+        <w:t xml:space="preserve"> desired statistics. It also validate</w:t>
+      </w:r>
+      <w:r>
+        <w:rPr>
+          <w:lang w:val="en-GB"/>
+        </w:rPr>
+        <w:t>d</w:t>
+      </w:r>
+      <w:r>
+        <w:rPr>
+          <w:lang w:val="en-GB"/>
+        </w:rPr>
+        <w:t xml:space="preserve"> that the simulated population conform</w:t>
+      </w:r>
+      <w:r>
+        <w:rPr>
+          <w:lang w:val="en-GB"/>
+        </w:rPr>
+        <w:t>ed</w:t>
+      </w:r>
+      <w:r>
+        <w:rPr>
+          <w:lang w:val="en-GB"/>
+        </w:rPr>
+        <w:t xml:space="preserve"> to the desired statistics </w:t>
+      </w:r>
+      <w:r>
+        <w:rPr>
+          <w:lang w:val="en-GB"/>
+        </w:rPr>
+        <w:t xml:space="preserve">through statistical analysis. The resulting population </w:t>
+      </w:r>
+      <w:r>
+        <w:rPr>
+          <w:lang w:val="en-GB"/>
+        </w:rPr>
+        <w:t>was</w:t>
+      </w:r>
+      <w:r>
+        <w:rPr>
+          <w:lang w:val="en-GB"/>
+        </w:rPr>
+        <w:t xml:space="preserve"> written out as a series of</w:t>
       </w:r>
       <w:r>
         <w:rPr>
@@ -3958,7 +3999,71 @@
         <w:rPr>
           <w:lang w:val="en-GB"/>
         </w:rPr>
-        <w:t>longer be compiled by late 2024.</w:t>
+        <w:t>longer be compiled by late 2024</w:t>
+      </w:r>
+      <w:r>
+        <w:rPr>
+          <w:lang w:val="en-GB"/>
+        </w:rPr>
+        <w:t xml:space="preserve"> due to dependenc</w:t>
+      </w:r>
+      <w:r>
+        <w:rPr>
+          <w:lang w:val="en-GB"/>
+        </w:rPr>
+        <w:t>y issues</w:t>
+      </w:r>
+      <w:r>
+        <w:rPr>
+          <w:lang w:val="en-GB"/>
+        </w:rPr>
+        <w:t>.</w:t>
+      </w:r>
+    </w:p>
+    <w:p>
+      <w:pPr>
+        <w:pStyle w:val="BodyText"/>
+        <w:spacing w:line="360" w:lineRule="auto"/>
+        <w:jc w:val="both"/>
+        <w:rPr>
+          <w:lang w:val="en-GB"/>
+        </w:rPr>
+      </w:pPr>
+      <w:r>
+        <w:rPr>
+          <w:lang w:val="en-GB"/>
+        </w:rPr>
+        <w:t>ValiPop</w:t>
+      </w:r>
+      <w:r>
+        <w:rPr>
+          <w:lang w:val="en-GB"/>
+        </w:rPr>
+        <w:t xml:space="preserve"> was </w:t>
+      </w:r>
+      <w:r>
+        <w:rPr>
+          <w:lang w:val="en-GB"/>
+        </w:rPr>
+        <w:t>divided into three phases during its execution, the simulation phase which generates the population, the validation phase which compares the population to the statistics, and the results recording phase where the population records are written</w:t>
+      </w:r>
+      <w:r>
+        <w:rPr>
+          <w:lang w:val="en-GB"/>
+        </w:rPr>
+        <w:t>. The following sections</w:t>
+      </w:r>
+      <w:r>
+        <w:rPr>
+          <w:lang w:val="en-GB"/>
+        </w:rPr>
+        <w:t xml:space="preserve"> go into depth on the design, complexities, and problems of ValiPop and its phases</w:t>
+      </w:r>
+      <w:r>
+        <w:rPr>
+          <w:lang w:val="en-GB"/>
+        </w:rPr>
+        <w:t xml:space="preserve"> to contextualise the requirements for this project.</w:t>
       </w:r>
     </w:p>
     <w:p>
@@ -4018,11 +4123,655 @@
           <w:color w:val="auto"/>
           <w:lang w:val="en-GB"/>
         </w:rPr>
+        <w:t xml:space="preserve">The ValiPop </w:t>
+      </w:r>
+      <w:r>
+        <w:rPr>
+          <w:color w:val="auto"/>
+          <w:lang w:val="en-GB"/>
+        </w:rPr>
+        <w:t>Repository</w:t>
+      </w:r>
+    </w:p>
+    <w:p>
+      <w:pPr>
+        <w:pStyle w:val="BodyText"/>
+        <w:spacing w:line="360" w:lineRule="auto"/>
+        <w:jc w:val="both"/>
+        <w:rPr>
+          <w:lang w:val="en-GB"/>
+        </w:rPr>
+      </w:pPr>
+      <w:r>
+        <w:rPr>
+          <w:lang w:val="en-GB"/>
+        </w:rPr>
+        <w:t>The</w:t>
+      </w:r>
+      <w:r>
+        <w:rPr>
+          <w:lang w:val="en-GB"/>
+        </w:rPr>
+        <w:t xml:space="preserve"> original</w:t>
+      </w:r>
+      <w:r>
+        <w:rPr>
+          <w:lang w:val="en-GB"/>
+        </w:rPr>
+        <w:t xml:space="preserve"> ValiPop repository on </w:t>
+      </w:r>
+      <w:hyperlink r:id="rId9" w:history="1">
+        <w:r>
+          <w:rPr>
+            <w:rStyle w:val="Hyperlink"/>
+            <w:lang w:val="en-GB"/>
+          </w:rPr>
+          <w:t>Git</w:t>
+        </w:r>
+        <w:r>
+          <w:rPr>
+            <w:rStyle w:val="Hyperlink"/>
+            <w:lang w:val="en-GB"/>
+          </w:rPr>
+          <w:t>H</w:t>
+        </w:r>
+        <w:r>
+          <w:rPr>
+            <w:rStyle w:val="Hyperlink"/>
+            <w:lang w:val="en-GB"/>
+          </w:rPr>
+          <w:t>ub</w:t>
+        </w:r>
+      </w:hyperlink>
+      <w:r>
+        <w:rPr>
+          <w:lang w:val="en-GB"/>
+        </w:rPr>
+        <w:t xml:space="preserve"> contained the </w:t>
+      </w:r>
+      <w:r>
+        <w:rPr>
+          <w:lang w:val="en-GB"/>
+        </w:rPr>
+        <w:t xml:space="preserve">ValiPop program source code. </w:t>
+      </w:r>
+      <w:r>
+        <w:rPr>
+          <w:lang w:val="en-GB"/>
+        </w:rPr>
+        <w:t>The original ValiPop program was written primarily in Java, using additional R and shell scripts programmatically executed from the Java code.</w:t>
+      </w:r>
+    </w:p>
+    <w:p>
+      <w:pPr>
+        <w:pStyle w:val="BodyText"/>
+        <w:spacing w:line="360" w:lineRule="auto"/>
+        <w:jc w:val="both"/>
+        <w:rPr>
+          <w:lang w:val="en-GB"/>
+        </w:rPr>
+      </w:pPr>
+      <w:r>
+        <w:rPr>
+          <w:lang w:val="en-GB"/>
+        </w:rPr>
+        <w:t>How</w:t>
+      </w:r>
+      <w:r>
+        <w:rPr>
+          <w:lang w:val="en-GB"/>
+        </w:rPr>
+        <w:t>ever, t</w:t>
+      </w:r>
+      <w:r>
+        <w:rPr>
+          <w:lang w:val="en-GB"/>
+        </w:rPr>
+        <w:t xml:space="preserve">he ValiPop repository also contained many unnecessary and deprecated files. The repository contained many files relating to the research performed by Dr. Dalton on his thesis,  however they </w:t>
+      </w:r>
+      <w:r>
+        <w:rPr>
+          <w:lang w:val="en-GB"/>
+        </w:rPr>
+        <w:t>were</w:t>
+      </w:r>
+      <w:r>
+        <w:rPr>
+          <w:lang w:val="en-GB"/>
+        </w:rPr>
+        <w:t xml:space="preserve"> ultimately </w:t>
+      </w:r>
+      <w:r>
+        <w:rPr>
+          <w:lang w:val="en-GB"/>
+        </w:rPr>
+        <w:t>irrelevant</w:t>
+      </w:r>
+      <w:r>
+        <w:rPr>
+          <w:lang w:val="en-GB"/>
+        </w:rPr>
+        <w:t xml:space="preserve"> to the execution and maintenance of ValiPop. As ValiPop had gone through several major changes during its development, the repository also included </w:t>
+      </w:r>
+      <w:r>
+        <w:rPr>
+          <w:lang w:val="en-GB"/>
+        </w:rPr>
+        <w:t>many unused and presumably deprecated files such as over 50 R scripts never invoked by the ValiPop program. Notably, some files and directories in the repository have names incompatible with the Windows operating system, meaning users on Windows machines cannot download the repository.</w:t>
+      </w:r>
+    </w:p>
+    <w:p>
+      <w:pPr>
+        <w:pStyle w:val="BodyText"/>
+        <w:spacing w:line="360" w:lineRule="auto"/>
+        <w:jc w:val="both"/>
+        <w:rPr>
+          <w:lang w:val="en-GB"/>
+        </w:rPr>
+      </w:pPr>
+      <w:r>
+        <w:rPr>
+          <w:lang w:val="en-GB"/>
+        </w:rPr>
+        <w:t xml:space="preserve">The repository contained some documentation; however, it was mostly incomplete and written for much older versions of ValiPop. The source code also included some use of Javadoc, but </w:t>
+      </w:r>
+      <w:r>
+        <w:rPr>
+          <w:lang w:val="en-GB"/>
+        </w:rPr>
+        <w:t>only sporadically and n</w:t>
+      </w:r>
+      <w:r>
+        <w:rPr>
+          <w:lang w:val="en-GB"/>
+        </w:rPr>
+        <w:t xml:space="preserve">ot in </w:t>
+      </w:r>
+      <w:r>
+        <w:rPr>
+          <w:lang w:val="en-GB"/>
+        </w:rPr>
+        <w:t>detail</w:t>
+      </w:r>
+      <w:r>
+        <w:rPr>
+          <w:lang w:val="en-GB"/>
+        </w:rPr>
+        <w:t>.</w:t>
+      </w:r>
+    </w:p>
+    <w:p>
+      <w:pPr>
+        <w:pStyle w:val="BodyText"/>
+        <w:spacing w:line="360" w:lineRule="auto"/>
+        <w:jc w:val="both"/>
+        <w:rPr>
+          <w:lang w:val="en-GB"/>
+        </w:rPr>
+      </w:pPr>
+      <w:r>
+        <w:rPr>
+          <w:lang w:val="en-GB"/>
+        </w:rPr>
+        <w:t>There were some Java tests present in the repository, however they no longer compiled due to missing dependencies. Moreover, the tests only covered very specific areas of the program, overlooking the program overall.  Some tests were also implemented but ignored for execution, presumably due to them failing.</w:t>
+      </w:r>
+    </w:p>
+    <w:p>
+      <w:pPr>
+        <w:pStyle w:val="Heading4"/>
+        <w:spacing w:line="360" w:lineRule="auto"/>
+        <w:jc w:val="both"/>
+        <w:rPr>
+          <w:color w:val="auto"/>
+          <w:lang w:val="en-GB"/>
+        </w:rPr>
+      </w:pPr>
+      <w:r>
+        <w:rPr>
+          <w:color w:val="auto"/>
+          <w:lang w:val="en-GB"/>
+        </w:rPr>
+        <w:t>2</w:t>
+      </w:r>
+      <w:r>
+        <w:rPr>
+          <w:color w:val="auto"/>
+          <w:lang w:val="en-GB"/>
+        </w:rPr>
+        <w:t>.</w:t>
+      </w:r>
+      <w:r>
+        <w:rPr>
+          <w:color w:val="auto"/>
+          <w:lang w:val="en-GB"/>
+        </w:rPr>
+        <w:t>3</w:t>
+      </w:r>
+      <w:r>
+        <w:rPr>
+          <w:color w:val="auto"/>
+          <w:lang w:val="en-GB"/>
+        </w:rPr>
+        <w:t>.</w:t>
+      </w:r>
+      <w:r>
+        <w:rPr>
+          <w:color w:val="auto"/>
+          <w:lang w:val="en-GB"/>
+        </w:rPr>
+        <w:t>2</w:t>
+      </w:r>
+      <w:r>
+        <w:rPr>
+          <w:color w:val="auto"/>
+          <w:lang w:val="en-GB"/>
+        </w:rPr>
+        <w:t xml:space="preserve">. </w:t>
+      </w:r>
+      <w:r>
+        <w:rPr>
+          <w:color w:val="auto"/>
+          <w:lang w:val="en-GB"/>
+        </w:rPr>
+        <w:t>ValiPop</w:t>
+      </w:r>
+      <w:r>
+        <w:rPr>
+          <w:color w:val="auto"/>
+          <w:lang w:val="en-GB"/>
+        </w:rPr>
+        <w:t xml:space="preserve"> </w:t>
+      </w:r>
+      <w:r>
+        <w:rPr>
+          <w:color w:val="auto"/>
+          <w:lang w:val="en-GB"/>
+        </w:rPr>
+        <w:t>Execution</w:t>
+      </w:r>
+    </w:p>
+    <w:p>
+      <w:pPr>
+        <w:pStyle w:val="BodyText"/>
+        <w:spacing w:line="360" w:lineRule="auto"/>
+        <w:rPr>
+          <w:lang w:val="en-GB"/>
+        </w:rPr>
+      </w:pPr>
+      <w:r>
+        <w:rPr>
+          <w:lang w:val="en-GB"/>
+        </w:rPr>
+        <w:t>To execute the</w:t>
+      </w:r>
+      <w:r>
+        <w:rPr>
+          <w:lang w:val="en-GB"/>
+        </w:rPr>
+        <w:t xml:space="preserve"> original ValiPop program</w:t>
+      </w:r>
+      <w:r>
+        <w:rPr>
+          <w:lang w:val="en-GB"/>
+        </w:rPr>
+        <w:t>,</w:t>
+      </w:r>
+      <w:r>
+        <w:rPr>
+          <w:lang w:val="en-GB"/>
+        </w:rPr>
+        <w:t xml:space="preserve"> </w:t>
+      </w:r>
+      <w:r>
+        <w:rPr>
+          <w:lang w:val="en-GB"/>
+        </w:rPr>
+        <w:t xml:space="preserve">it first required </w:t>
+      </w:r>
+      <w:r>
+        <w:rPr>
+          <w:lang w:val="en-GB"/>
+        </w:rPr>
+        <w:t>12 Java packages</w:t>
+      </w:r>
+      <w:r>
+        <w:rPr>
+          <w:lang w:val="en-GB"/>
+        </w:rPr>
+        <w:t xml:space="preserve"> installed with Maven</w:t>
+      </w:r>
+      <w:r>
+        <w:rPr>
+          <w:lang w:val="en-GB"/>
+        </w:rPr>
+        <w:t xml:space="preserve"> and 9 R packages which had be manual installed. The program also required a Unix shell to execute the included shell scripts, making it unusable on Windows. The ValiPop program was executed by running a shell script, which itself ran Maven to compile and run ValiPop.</w:t>
+      </w:r>
+      <w:r>
+        <w:rPr>
+          <w:lang w:val="en-GB"/>
+        </w:rPr>
+        <w:t xml:space="preserve"> </w:t>
+      </w:r>
+      <w:r>
+        <w:rPr>
+          <w:lang w:val="en-GB"/>
+        </w:rPr>
+        <w:t>There was no distributed build of ValiPop, and users had to first download and build the ValiPop program source code to execute it.</w:t>
+      </w:r>
+    </w:p>
+    <w:p>
+      <w:pPr>
+        <w:pStyle w:val="BodyText"/>
+        <w:spacing w:line="360" w:lineRule="auto"/>
+        <w:rPr>
+          <w:lang w:val="en-GB"/>
+        </w:rPr>
+      </w:pPr>
+      <w:r>
+        <w:rPr>
+          <w:lang w:val="en-GB"/>
+        </w:rPr>
+        <w:t xml:space="preserve">ValiPop was configured with up to 29 possible options defined in a configuration file passed to the program. It also read in a directory containing up to 23 statistical files describing the expected properties of the simulated population. There was </w:t>
+      </w:r>
+      <w:r>
+        <w:rPr>
+          <w:lang w:val="en-GB"/>
+        </w:rPr>
+        <w:t>notably no</w:t>
+      </w:r>
+      <w:r>
+        <w:rPr>
+          <w:lang w:val="en-GB"/>
+        </w:rPr>
+        <w:t xml:space="preserve"> </w:t>
+      </w:r>
+      <w:r>
+        <w:rPr>
+          <w:lang w:val="en-GB"/>
+        </w:rPr>
+        <w:t>validation or error handling of these user-specified inputs, and incorrect values could cause unexpected behaviour during execution.</w:t>
+      </w:r>
+    </w:p>
+    <w:p>
+      <w:pPr>
+        <w:pStyle w:val="BodyText"/>
+        <w:spacing w:line="360" w:lineRule="auto"/>
+        <w:rPr>
+          <w:lang w:val="en-GB"/>
+        </w:rPr>
+      </w:pPr>
+      <w:r>
+        <w:rPr>
+          <w:lang w:val="en-GB"/>
+        </w:rPr>
+        <w:t>To compliment the program, the ValiPop repository also included some sample configurations and input statistics which could be used. However, most of the configuration files provided included absolute paths to directories on local machines, making them unusable.</w:t>
+      </w:r>
+    </w:p>
+    <w:p>
+      <w:pPr>
+        <w:pStyle w:val="Heading4"/>
+        <w:spacing w:line="360" w:lineRule="auto"/>
+        <w:jc w:val="both"/>
+        <w:rPr>
+          <w:color w:val="auto"/>
+          <w:lang w:val="en-GB"/>
+        </w:rPr>
+      </w:pPr>
+      <w:r>
+        <w:rPr>
+          <w:color w:val="auto"/>
+          <w:lang w:val="en-GB"/>
+        </w:rPr>
+        <w:t>2</w:t>
+      </w:r>
+      <w:r>
+        <w:rPr>
+          <w:color w:val="auto"/>
+          <w:lang w:val="en-GB"/>
+        </w:rPr>
+        <w:t>.</w:t>
+      </w:r>
+      <w:r>
+        <w:rPr>
+          <w:color w:val="auto"/>
+          <w:lang w:val="en-GB"/>
+        </w:rPr>
+        <w:t>3</w:t>
+      </w:r>
+      <w:r>
+        <w:rPr>
+          <w:color w:val="auto"/>
+          <w:lang w:val="en-GB"/>
+        </w:rPr>
+        <w:t>.</w:t>
+      </w:r>
+      <w:r>
+        <w:rPr>
+          <w:color w:val="auto"/>
+          <w:lang w:val="en-GB"/>
+        </w:rPr>
+        <w:t>3</w:t>
+      </w:r>
+      <w:r>
+        <w:rPr>
+          <w:color w:val="auto"/>
+          <w:lang w:val="en-GB"/>
+        </w:rPr>
+        <w:t xml:space="preserve">. </w:t>
+      </w:r>
+      <w:r>
+        <w:rPr>
+          <w:color w:val="auto"/>
+          <w:lang w:val="en-GB"/>
+        </w:rPr>
         <w:t>ValiPop Population Simulation</w:t>
       </w:r>
     </w:p>
     <w:p>
       <w:pPr>
+        <w:pStyle w:val="BodyText"/>
+        <w:spacing w:line="360" w:lineRule="auto"/>
+        <w:rPr>
+          <w:lang w:val="en-GB"/>
+        </w:rPr>
+      </w:pPr>
+      <w:r>
+        <w:rPr>
+          <w:lang w:val="en-GB"/>
+        </w:rPr>
+        <w:t xml:space="preserve">The ValiPop population simulation was written in Java. </w:t>
+      </w:r>
+      <w:r>
+        <w:rPr>
+          <w:lang w:val="en-GB"/>
+        </w:rPr>
+        <w:t xml:space="preserve">Many of the configuration options defined properties of the simulation such as the starting population size and duration of the simulation. The simulation </w:t>
+      </w:r>
+      <w:r>
+        <w:rPr>
+          <w:lang w:val="en-GB"/>
+        </w:rPr>
+        <w:t>divided its period of execution into a sequence of time steps, each typically a year. The input statistics were used to determine the expected number of births, deaths and other events to occur at each time step. The simulation also handled partnering,</w:t>
+      </w:r>
+      <w:r>
+        <w:rPr>
+          <w:lang w:val="en-GB"/>
+        </w:rPr>
+        <w:t xml:space="preserve"> adultery,</w:t>
+      </w:r>
+      <w:r>
+        <w:rPr>
+          <w:lang w:val="en-GB"/>
+        </w:rPr>
+        <w:t xml:space="preserve"> separation of partners, migration of people to and from the population, occupations, and address changes of people.</w:t>
+      </w:r>
+    </w:p>
+    <w:p>
+      <w:pPr>
+        <w:pStyle w:val="BodyText"/>
+        <w:spacing w:line="360" w:lineRule="auto"/>
+        <w:rPr>
+          <w:lang w:val="en-GB"/>
+        </w:rPr>
+      </w:pPr>
+      <w:r>
+        <w:rPr>
+          <w:lang w:val="en-GB"/>
+        </w:rPr>
+        <w:t>In case the simulation c</w:t>
+      </w:r>
+      <w:r>
+        <w:rPr>
+          <w:lang w:val="en-GB"/>
+        </w:rPr>
+        <w:t>ould not</w:t>
+      </w:r>
+      <w:r>
+        <w:rPr>
+          <w:lang w:val="en-GB"/>
+        </w:rPr>
+        <w:t xml:space="preserve"> fulfil an expected number of some event, it employ</w:t>
+      </w:r>
+      <w:r>
+        <w:rPr>
+          <w:lang w:val="en-GB"/>
+        </w:rPr>
+        <w:t>ed</w:t>
+      </w:r>
+      <w:r>
+        <w:rPr>
+          <w:lang w:val="en-GB"/>
+        </w:rPr>
+        <w:t xml:space="preserve"> a self-correction mechanism which increase</w:t>
+      </w:r>
+      <w:r>
+        <w:rPr>
+          <w:lang w:val="en-GB"/>
+        </w:rPr>
+        <w:t>d</w:t>
+      </w:r>
+      <w:r>
+        <w:rPr>
+          <w:lang w:val="en-GB"/>
+        </w:rPr>
+        <w:t xml:space="preserve"> the expected number of </w:t>
+      </w:r>
+      <w:r>
+        <w:rPr>
+          <w:lang w:val="en-GB"/>
+        </w:rPr>
+        <w:t xml:space="preserve">that </w:t>
+      </w:r>
+      <w:r>
+        <w:rPr>
+          <w:lang w:val="en-GB"/>
+        </w:rPr>
+        <w:t xml:space="preserve">event to occur in the next time step. This self-correction mechanism </w:t>
+      </w:r>
+      <w:r>
+        <w:rPr>
+          <w:lang w:val="en-GB"/>
+        </w:rPr>
+        <w:t>was</w:t>
+      </w:r>
+      <w:r>
+        <w:rPr>
+          <w:lang w:val="en-GB"/>
+        </w:rPr>
+        <w:t xml:space="preserve"> used to correct deviations from the statistical inputs during the simulation and c</w:t>
+      </w:r>
+      <w:r>
+        <w:rPr>
+          <w:lang w:val="en-GB"/>
+        </w:rPr>
+        <w:t>ould</w:t>
+      </w:r>
+      <w:r>
+        <w:rPr>
+          <w:lang w:val="en-GB"/>
+        </w:rPr>
+        <w:t xml:space="preserve"> also be configured.</w:t>
+      </w:r>
+    </w:p>
+    <w:p>
+      <w:pPr>
+        <w:pStyle w:val="BodyText"/>
+        <w:spacing w:line="360" w:lineRule="auto"/>
+        <w:rPr>
+          <w:lang w:val="en-GB"/>
+        </w:rPr>
+      </w:pPr>
+      <w:r>
+        <w:rPr>
+          <w:lang w:val="en-GB"/>
+        </w:rPr>
+        <w:t>Due to the depth of the simulation</w:t>
+      </w:r>
+      <w:r>
+        <w:rPr>
+          <w:lang w:val="en-GB"/>
+        </w:rPr>
+        <w:t xml:space="preserve"> </w:t>
+      </w:r>
+      <w:r>
+        <w:rPr>
+          <w:lang w:val="en-GB"/>
+        </w:rPr>
+        <w:t xml:space="preserve">and necessity to </w:t>
+      </w:r>
+      <w:r>
+        <w:rPr>
+          <w:lang w:val="en-GB"/>
+        </w:rPr>
+        <w:t>remain statistically correct, much of the simulation operate</w:t>
+      </w:r>
+      <w:r>
+        <w:rPr>
+          <w:lang w:val="en-GB"/>
+        </w:rPr>
+        <w:t>d</w:t>
+      </w:r>
+      <w:r>
+        <w:rPr>
+          <w:lang w:val="en-GB"/>
+        </w:rPr>
+        <w:t xml:space="preserve"> quite unintuitively. For example, at each time step, eligible woman </w:t>
+      </w:r>
+      <w:proofErr w:type="gramStart"/>
+      <w:r>
+        <w:rPr>
+          <w:lang w:val="en-GB"/>
+        </w:rPr>
+        <w:t>w</w:t>
+      </w:r>
+      <w:r>
+        <w:rPr>
+          <w:lang w:val="en-GB"/>
+        </w:rPr>
+        <w:t>ere</w:t>
+      </w:r>
+      <w:proofErr w:type="gramEnd"/>
+      <w:r>
+        <w:rPr>
+          <w:lang w:val="en-GB"/>
+        </w:rPr>
+        <w:t xml:space="preserve"> </w:t>
+      </w:r>
+      <w:r>
+        <w:rPr>
+          <w:lang w:val="en-GB"/>
+        </w:rPr>
+        <w:t>first selected to birth the expected number of children, and if they did not already have a partner, they were arranged with one such that the partnership occurred before the birth of the child.</w:t>
+      </w:r>
+      <w:r>
+        <w:rPr>
+          <w:lang w:val="en-GB"/>
+        </w:rPr>
+        <w:t xml:space="preserve"> Consequently, this made the simulation code quite complex and convoluted in some respects to maintain its validity.</w:t>
+      </w:r>
+    </w:p>
+    <w:p>
+      <w:pPr>
         <w:pStyle w:val="Heading4"/>
         <w:spacing w:line="360" w:lineRule="auto"/>
         <w:jc w:val="both"/>
@@ -4064,6 +4813,280 @@
           <w:color w:val="auto"/>
           <w:lang w:val="en-GB"/>
         </w:rPr>
+        <w:t>4</w:t>
+      </w:r>
+      <w:r>
+        <w:rPr>
+          <w:color w:val="auto"/>
+          <w:lang w:val="en-GB"/>
+        </w:rPr>
+        <w:t xml:space="preserve">. </w:t>
+      </w:r>
+      <w:r>
+        <w:rPr>
+          <w:color w:val="auto"/>
+          <w:lang w:val="en-GB"/>
+        </w:rPr>
+        <w:t>ValiPop Validation</w:t>
+      </w:r>
+    </w:p>
+    <w:p>
+      <w:pPr>
+        <w:pStyle w:val="FirstParagraph"/>
+        <w:spacing w:line="360" w:lineRule="auto"/>
+        <w:jc w:val="both"/>
+        <w:rPr>
+          <w:lang w:val="en-GB"/>
+        </w:rPr>
+      </w:pPr>
+      <w:r>
+        <w:rPr>
+          <w:lang w:val="en-GB"/>
+        </w:rPr>
+        <w:t>The validation phase</w:t>
+      </w:r>
+      <w:r>
+        <w:rPr>
+          <w:lang w:val="en-GB"/>
+        </w:rPr>
+        <w:t xml:space="preserve"> was </w:t>
+      </w:r>
+      <w:r>
+        <w:rPr>
+          <w:lang w:val="en-GB"/>
+        </w:rPr>
+        <w:t>written using R and shell scripts.</w:t>
+      </w:r>
+      <w:r>
+        <w:rPr>
+          <w:lang w:val="en-GB"/>
+        </w:rPr>
+        <w:t xml:space="preserve"> </w:t>
+      </w:r>
+      <w:r>
+        <w:rPr>
+          <w:lang w:val="en-GB"/>
+        </w:rPr>
+        <w:t>These scripts were invoked programmatically from Java</w:t>
+      </w:r>
+      <w:r>
+        <w:rPr>
+          <w:lang w:val="en-GB"/>
+        </w:rPr>
+        <w:t xml:space="preserve"> to analyse and interpret the similarity of the population against the expected statistics. The result was then eventually read back into the Java program.</w:t>
+      </w:r>
+    </w:p>
+    <w:p>
+      <w:pPr>
+        <w:pStyle w:val="BodyText"/>
+        <w:spacing w:line="360" w:lineRule="auto"/>
+        <w:jc w:val="both"/>
+        <w:rPr>
+          <w:lang w:val="en-GB"/>
+        </w:rPr>
+      </w:pPr>
+      <w:r>
+        <w:rPr>
+          <w:lang w:val="en-GB"/>
+        </w:rPr>
+        <w:t xml:space="preserve">Once </w:t>
+      </w:r>
+      <w:r>
+        <w:rPr>
+          <w:lang w:val="en-GB"/>
+        </w:rPr>
+        <w:t>a population was simulated in Java</w:t>
+      </w:r>
+      <w:r>
+        <w:rPr>
+          <w:lang w:val="en-GB"/>
+        </w:rPr>
+        <w:t>, it was written to several contingency tables which recorded the frequency of birth</w:t>
+      </w:r>
+      <w:r>
+        <w:rPr>
+          <w:lang w:val="en-GB"/>
+        </w:rPr>
+        <w:t>s</w:t>
+      </w:r>
+      <w:r>
+        <w:rPr>
+          <w:lang w:val="en-GB"/>
+        </w:rPr>
+        <w:t xml:space="preserve">, deaths, and partnerships. The expected frequencies of these properties were also calculated from the input statistics, and both </w:t>
+      </w:r>
+      <w:r>
+        <w:rPr>
+          <w:lang w:val="en-GB"/>
+        </w:rPr>
+        <w:t>were</w:t>
+      </w:r>
+      <w:r>
+        <w:rPr>
+          <w:lang w:val="en-GB"/>
+        </w:rPr>
+        <w:t xml:space="preserve"> </w:t>
+      </w:r>
+      <w:r>
+        <w:rPr>
+          <w:lang w:val="en-GB"/>
+        </w:rPr>
+        <w:t xml:space="preserve">passed to R </w:t>
+      </w:r>
+      <w:r>
+        <w:rPr>
+          <w:lang w:val="en-GB"/>
+        </w:rPr>
+        <w:t>scripts</w:t>
+      </w:r>
+      <w:r>
+        <w:rPr>
+          <w:lang w:val="en-GB"/>
+        </w:rPr>
+        <w:t xml:space="preserve"> for analysis</w:t>
+      </w:r>
+      <w:r>
+        <w:rPr>
+          <w:lang w:val="en-GB"/>
+        </w:rPr>
+        <w:t>. The R scripts compare</w:t>
+      </w:r>
+      <w:r>
+        <w:rPr>
+          <w:lang w:val="en-GB"/>
+        </w:rPr>
+        <w:t>d</w:t>
+      </w:r>
+      <w:r>
+        <w:rPr>
+          <w:lang w:val="en-GB"/>
+        </w:rPr>
+        <w:t xml:space="preserve"> the expected and actual frequencies using a Generalized Estimating Equations Generalized Linear Model (GEEGLM), and the outputted p</w:t>
+      </w:r>
+      <w:r>
+        <w:rPr>
+          <w:lang w:val="en-GB"/>
+        </w:rPr>
+        <w:t>-</w:t>
+      </w:r>
+      <w:r>
+        <w:rPr>
+          <w:lang w:val="en-GB"/>
+        </w:rPr>
+        <w:t>values describe</w:t>
+      </w:r>
+      <w:r>
+        <w:rPr>
+          <w:lang w:val="en-GB"/>
+        </w:rPr>
+        <w:t>d</w:t>
+      </w:r>
+      <w:r>
+        <w:rPr>
+          <w:lang w:val="en-GB"/>
+        </w:rPr>
+        <w:t xml:space="preserve"> the statistical significance between the expected and actual events.</w:t>
+      </w:r>
+    </w:p>
+    <w:p>
+      <w:pPr>
+        <w:pStyle w:val="BodyText"/>
+        <w:spacing w:line="360" w:lineRule="auto"/>
+        <w:jc w:val="both"/>
+        <w:rPr>
+          <w:lang w:val="en-GB"/>
+        </w:rPr>
+      </w:pPr>
+      <w:r>
+        <w:rPr>
+          <w:lang w:val="en-GB"/>
+        </w:rPr>
+        <w:t>The shell script counted the volume and magnitude of significant p</w:t>
+      </w:r>
+      <w:r>
+        <w:rPr>
+          <w:lang w:val="en-GB"/>
+        </w:rPr>
+        <w:t>-</w:t>
+      </w:r>
+      <w:r>
+        <w:rPr>
+          <w:lang w:val="en-GB"/>
+        </w:rPr>
+        <w:t>values and calculated a validation score</w:t>
+      </w:r>
+      <w:r>
+        <w:rPr>
+          <w:lang w:val="en-GB"/>
+        </w:rPr>
+        <w:t xml:space="preserve"> which was passed to Java</w:t>
+      </w:r>
+      <w:r>
+        <w:rPr>
+          <w:lang w:val="en-GB"/>
+        </w:rPr>
+        <w:t xml:space="preserve">. The higher the validation score, </w:t>
+      </w:r>
+      <w:r>
+        <w:rPr>
+          <w:lang w:val="en-GB"/>
+        </w:rPr>
+        <w:t xml:space="preserve">the </w:t>
+      </w:r>
+      <w:r>
+        <w:rPr>
+          <w:lang w:val="en-GB"/>
+        </w:rPr>
+        <w:t>more significantly different the population was from the input statistics, where zero was the ideal score.</w:t>
+      </w:r>
+    </w:p>
+    <w:p>
+      <w:pPr>
+        <w:pStyle w:val="BodyText"/>
+        <w:spacing w:line="360" w:lineRule="auto"/>
+        <w:jc w:val="both"/>
+        <w:rPr>
+          <w:lang w:val="en-GB"/>
+        </w:rPr>
+      </w:pPr>
+      <w:r>
+        <w:rPr>
+          <w:lang w:val="en-GB"/>
+        </w:rPr>
+        <w:t>Notably, the results of the R analysis were rendered within an HTML file, displaying several graphs and analytics on the population. However, only a small part of the analysis was interpreted by the shell scripts, with the rest being ignored.</w:t>
+      </w:r>
+    </w:p>
+    <w:p>
+      <w:pPr>
+        <w:pStyle w:val="BodyText"/>
+        <w:spacing w:line="360" w:lineRule="auto"/>
+        <w:jc w:val="both"/>
+        <w:rPr>
+          <w:lang w:val="en-GB"/>
+        </w:rPr>
+      </w:pPr>
+      <w:r>
+        <w:rPr>
+          <w:lang w:val="en-GB"/>
+        </w:rPr>
+        <w:t>In the case of a validation score being too high, the ValiPop repository included additional programs which helped find optimal configurations that reduced the validation score. These were Java programs which tested various configuration options which altered the ValiPop simulation’s self-correction mechanism.</w:t>
+      </w:r>
+    </w:p>
+    <w:p>
+      <w:pPr>
+        <w:pStyle w:val="Heading4"/>
+        <w:spacing w:line="360" w:lineRule="auto"/>
+        <w:jc w:val="both"/>
+        <w:rPr>
+          <w:color w:val="auto"/>
+          <w:lang w:val="en-GB"/>
+        </w:rPr>
+      </w:pPr>
+      <w:r>
+        <w:rPr>
+          <w:color w:val="auto"/>
+          <w:lang w:val="en-GB"/>
+        </w:rPr>
         <w:t>2</w:t>
       </w:r>
       <w:r>
@@ -4071,6 +5094,34 @@
           <w:color w:val="auto"/>
           <w:lang w:val="en-GB"/>
         </w:rPr>
+        <w:t>.</w:t>
+      </w:r>
+      <w:r>
+        <w:rPr>
+          <w:color w:val="auto"/>
+          <w:lang w:val="en-GB"/>
+        </w:rPr>
+        <w:t>3</w:t>
+      </w:r>
+      <w:r>
+        <w:rPr>
+          <w:color w:val="auto"/>
+          <w:lang w:val="en-GB"/>
+        </w:rPr>
+        <w:t>.</w:t>
+      </w:r>
+      <w:r>
+        <w:rPr>
+          <w:color w:val="auto"/>
+          <w:lang w:val="en-GB"/>
+        </w:rPr>
+        <w:t>5</w:t>
+      </w:r>
+      <w:r>
+        <w:rPr>
+          <w:color w:val="auto"/>
+          <w:lang w:val="en-GB"/>
+        </w:rPr>
         <w:t xml:space="preserve">. </w:t>
       </w:r>
       <w:r>
@@ -4078,233 +5129,523 @@
           <w:color w:val="auto"/>
           <w:lang w:val="en-GB"/>
         </w:rPr>
-        <w:t xml:space="preserve">ValiPop </w:t>
-      </w:r>
-      <w:r>
-        <w:rPr>
-          <w:color w:val="auto"/>
-          <w:lang w:val="en-GB"/>
-        </w:rPr>
-        <w:t>Validation</w:t>
-      </w:r>
-    </w:p>
-    <w:p>
-      <w:pPr>
-        <w:pStyle w:val="Heading4"/>
-        <w:spacing w:line="360" w:lineRule="auto"/>
-        <w:jc w:val="both"/>
-        <w:rPr>
-          <w:color w:val="auto"/>
-          <w:lang w:val="en-GB"/>
-        </w:rPr>
-      </w:pPr>
-      <w:r>
-        <w:rPr>
-          <w:color w:val="auto"/>
-          <w:lang w:val="en-GB"/>
-        </w:rPr>
-        <w:t>2</w:t>
-      </w:r>
-      <w:r>
-        <w:rPr>
-          <w:color w:val="auto"/>
+        <w:t>ValiPop Results Recording</w:t>
+      </w:r>
+    </w:p>
+    <w:p>
+      <w:pPr>
+        <w:pStyle w:val="FirstParagraph"/>
+        <w:spacing w:line="360" w:lineRule="auto"/>
+        <w:jc w:val="both"/>
+        <w:rPr>
+          <w:lang w:val="en-GB"/>
+        </w:rPr>
+      </w:pPr>
+      <w:r>
+        <w:rPr>
+          <w:lang w:val="en-GB"/>
+        </w:rPr>
+        <w:t>The result recording phase of the old ValiPop was also implemented in Java. The simulated population</w:t>
+      </w:r>
+      <w:r>
+        <w:rPr>
+          <w:lang w:val="en-GB"/>
+        </w:rPr>
+        <w:t xml:space="preserve"> was </w:t>
+      </w:r>
+      <w:r>
+        <w:rPr>
+          <w:lang w:val="en-GB"/>
+        </w:rPr>
+        <w:t>written to birth, death, and marriage records</w:t>
+      </w:r>
+      <w:r>
+        <w:rPr>
+          <w:lang w:val="en-GB"/>
+        </w:rPr>
+        <w:t xml:space="preserve"> </w:t>
+      </w:r>
+      <w:r>
+        <w:rPr>
+          <w:lang w:val="en-GB"/>
+        </w:rPr>
+        <w:t>determined by the output format specified in the configuration. Once all the records were written the program terminated.</w:t>
+      </w:r>
+    </w:p>
+    <w:p>
+      <w:pPr>
+        <w:pStyle w:val="BodyText"/>
+        <w:spacing w:line="360" w:lineRule="auto"/>
+        <w:rPr>
+          <w:lang w:val="en-GB"/>
+        </w:rPr>
+      </w:pPr>
+      <w:r>
+        <w:rPr>
+          <w:lang w:val="en-GB"/>
+        </w:rPr>
+        <w:t>Notably, only one record type, “TD”, consistently worked, whilst the other types occasionally threw errors based on the population they were generating. Each of the record format implementations also shared much of the same boilerplate code, making them harder to maintain.</w:t>
+      </w:r>
+      <w:bookmarkStart w:id="12" w:name="requirements-specification"/>
+    </w:p>
+    <w:p>
+      <w:pPr>
+        <w:pStyle w:val="BodyText"/>
+        <w:spacing w:line="360" w:lineRule="auto"/>
+        <w:rPr>
+          <w:lang w:val="en-GB"/>
+        </w:rPr>
+      </w:pPr>
+      <w:r>
+        <w:rPr>
+          <w:lang w:val="en-GB"/>
+        </w:rPr>
+        <w:t>Additionally,</w:t>
+      </w:r>
+      <w:r>
+        <w:rPr>
+          <w:lang w:val="en-GB"/>
+        </w:rPr>
+        <w:t xml:space="preserve"> there existed some graphical formats implemented in ValiPop that were inaccessible to the user. </w:t>
+      </w:r>
+      <w:r>
+        <w:rPr>
+          <w:lang w:val="en-GB"/>
+        </w:rPr>
+        <w:t xml:space="preserve">These were specifically </w:t>
+      </w:r>
+      <w:r>
+        <w:rPr>
+          <w:lang w:val="en-GB"/>
+        </w:rPr>
+        <w:t xml:space="preserve">the </w:t>
+      </w:r>
+      <w:r>
+        <w:rPr>
+          <w:lang w:val="en-GB"/>
+        </w:rPr>
+        <w:t xml:space="preserve">GEDCOM format, which is a common genealogical data structure (gedcom.org, 2019), and the GraphViz format, which is a file type for representing graphs (The GraphViz Authors, 2025). </w:t>
+      </w:r>
+      <w:r>
+        <w:rPr>
+          <w:lang w:val="en-GB"/>
+        </w:rPr>
+        <w:t>Although fully implemented in the source code, they were only invocable through tests written for them.</w:t>
+      </w:r>
+    </w:p>
+    <w:p>
+      <w:pPr>
+        <w:pStyle w:val="BodyText"/>
+        <w:rPr>
+          <w:lang w:val="en-GB"/>
+        </w:rPr>
+      </w:pPr>
+      <w:r>
+        <w:rPr>
+          <w:lang w:val="en-GB"/>
+        </w:rPr>
+        <w:br w:type="page"/>
+      </w:r>
+    </w:p>
+    <w:p>
+      <w:pPr>
+        <w:pStyle w:val="Heading2"/>
+        <w:spacing w:line="360" w:lineRule="auto"/>
+        <w:jc w:val="both"/>
+        <w:rPr>
+          <w:color w:val="auto"/>
+          <w:lang w:val="en-GB"/>
+        </w:rPr>
+      </w:pPr>
+      <w:bookmarkStart w:id="13" w:name="_Toc194328027"/>
+      <w:r>
+        <w:rPr>
+          <w:color w:val="auto"/>
+          <w:lang w:val="en-GB"/>
+        </w:rPr>
+        <w:t>3. Requirements Specification</w:t>
+      </w:r>
+      <w:bookmarkEnd w:id="12"/>
+      <w:bookmarkEnd w:id="13"/>
+    </w:p>
+    <w:p>
+      <w:pPr>
+        <w:pStyle w:val="FirstParagraph"/>
+        <w:spacing w:line="360" w:lineRule="auto"/>
+        <w:jc w:val="both"/>
+        <w:rPr>
+          <w:lang w:val="en-GB"/>
+        </w:rPr>
+      </w:pPr>
+      <w:r>
+        <w:rPr>
+          <w:lang w:val="en-GB"/>
+        </w:rPr>
+        <w:t>This chapter lists the original requirements as documented in the Description, Objectives, Ethics &amp; Resources (DOER) document submitted in the first semester.</w:t>
+      </w:r>
+      <w:r>
+        <w:rPr>
+          <w:lang w:val="en-GB"/>
+        </w:rPr>
+        <w:t xml:space="preserve"> Notably, the original ValiPop repository before the project is referred to as </w:t>
+      </w:r>
+      <w:r>
+        <w:rPr>
+          <w:i/>
+          <w:iCs/>
+          <w:lang w:val="en-GB"/>
+        </w:rPr>
+        <w:t>the old ValiPop</w:t>
+      </w:r>
+      <w:r>
+        <w:rPr>
           <w:lang w:val="en-GB"/>
         </w:rPr>
         <w:t>.</w:t>
       </w:r>
-      <w:r>
-        <w:rPr>
-          <w:color w:val="auto"/>
-          <w:lang w:val="en-GB"/>
-        </w:rPr>
-        <w:t>3</w:t>
-      </w:r>
-      <w:r>
-        <w:rPr>
-          <w:color w:val="auto"/>
-          <w:lang w:val="en-GB"/>
-        </w:rPr>
-        <w:t>.</w:t>
-      </w:r>
-      <w:r>
-        <w:rPr>
-          <w:color w:val="auto"/>
-          <w:lang w:val="en-GB"/>
-        </w:rPr>
-        <w:t>3</w:t>
-      </w:r>
-      <w:r>
-        <w:rPr>
-          <w:color w:val="auto"/>
-          <w:lang w:val="en-GB"/>
-        </w:rPr>
-        <w:t xml:space="preserve">. </w:t>
-      </w:r>
-      <w:r>
-        <w:rPr>
-          <w:color w:val="auto"/>
-          <w:lang w:val="en-GB"/>
-        </w:rPr>
-        <w:t xml:space="preserve">ValiPop </w:t>
-      </w:r>
-      <w:r>
-        <w:rPr>
-          <w:color w:val="auto"/>
-          <w:lang w:val="en-GB"/>
-        </w:rPr>
-        <w:t>Results Recording</w:t>
-      </w:r>
-    </w:p>
-    <w:p>
-      <w:pPr>
-        <w:pStyle w:val="Heading4"/>
-        <w:spacing w:line="360" w:lineRule="auto"/>
-        <w:jc w:val="both"/>
-        <w:rPr>
-          <w:color w:val="auto"/>
-          <w:lang w:val="en-GB"/>
-        </w:rPr>
-      </w:pPr>
-      <w:r>
-        <w:rPr>
-          <w:color w:val="auto"/>
-          <w:lang w:val="en-GB"/>
-        </w:rPr>
-        <w:t>2</w:t>
-      </w:r>
-      <w:r>
-        <w:rPr>
-          <w:color w:val="auto"/>
-          <w:lang w:val="en-GB"/>
-        </w:rPr>
-        <w:t>.</w:t>
-      </w:r>
-      <w:r>
-        <w:rPr>
-          <w:color w:val="auto"/>
-          <w:lang w:val="en-GB"/>
-        </w:rPr>
-        <w:t>3</w:t>
-      </w:r>
-      <w:r>
-        <w:rPr>
-          <w:color w:val="auto"/>
-          <w:lang w:val="en-GB"/>
-        </w:rPr>
-        <w:t>.</w:t>
-      </w:r>
-      <w:r>
-        <w:rPr>
-          <w:color w:val="auto"/>
-          <w:lang w:val="en-GB"/>
-        </w:rPr>
-        <w:t>4</w:t>
-      </w:r>
-      <w:r>
-        <w:rPr>
-          <w:color w:val="auto"/>
-          <w:lang w:val="en-GB"/>
-        </w:rPr>
-        <w:t xml:space="preserve">. </w:t>
-      </w:r>
-      <w:r>
-        <w:rPr>
-          <w:color w:val="auto"/>
-          <w:lang w:val="en-GB"/>
-        </w:rPr>
-        <w:t xml:space="preserve">ValiPop </w:t>
-      </w:r>
-      <w:r>
-        <w:rPr>
-          <w:color w:val="auto"/>
-          <w:lang w:val="en-GB"/>
-        </w:rPr>
-        <w:t>Deployment</w:t>
-      </w:r>
-    </w:p>
-    <w:p>
-      <w:pPr>
-        <w:pStyle w:val="BodyText"/>
-        <w:rPr>
-          <w:lang w:val="en-GB"/>
-        </w:rPr>
-      </w:pPr>
-    </w:p>
-    <w:p>
-      <w:pPr>
-        <w:pStyle w:val="BodyText"/>
-        <w:spacing w:line="360" w:lineRule="auto"/>
-        <w:jc w:val="both"/>
-        <w:rPr>
-          <w:lang w:val="en-GB"/>
-        </w:rPr>
-      </w:pPr>
-    </w:p>
-    <w:p>
-      <w:pPr>
-        <w:pStyle w:val="BodyText"/>
-        <w:spacing w:line="360" w:lineRule="auto"/>
-        <w:jc w:val="both"/>
-        <w:rPr>
-          <w:lang w:val="en-GB"/>
-        </w:rPr>
-      </w:pPr>
-      <w:r>
-        <w:rPr>
-          <w:lang w:val="en-GB"/>
-        </w:rPr>
-        <w:t xml:space="preserve">To differentiate between ValiPop before and after my work, the ValiPop version before my dissertation is referred to as </w:t>
-      </w:r>
-      <w:r>
-        <w:rPr>
-          <w:i/>
-          <w:lang w:val="en-GB"/>
-        </w:rPr>
-        <w:t>the old ValiPop</w:t>
-      </w:r>
-      <w:r>
-        <w:rPr>
-          <w:lang w:val="en-GB"/>
-        </w:rPr>
-        <w:t xml:space="preserve">. </w:t>
-      </w:r>
-      <w:r>
-        <w:rPr>
-          <w:lang w:val="en-GB"/>
-        </w:rPr>
-        <w:t>Additionally,</w:t>
-      </w:r>
-      <w:r>
-        <w:rPr>
-          <w:lang w:val="en-GB"/>
-        </w:rPr>
-        <w:t xml:space="preserve"> </w:t>
-      </w:r>
-      <w:r>
-        <w:rPr>
-          <w:i/>
-          <w:lang w:val="en-GB"/>
-        </w:rPr>
-        <w:t>ValiPop repository</w:t>
-      </w:r>
-      <w:r>
-        <w:rPr>
-          <w:lang w:val="en-GB"/>
-        </w:rPr>
-        <w:t xml:space="preserve"> refers to public repository where the ValiPop source code is hosted, and the </w:t>
-      </w:r>
-      <w:r>
-        <w:rPr>
-          <w:i/>
-          <w:lang w:val="en-GB"/>
-        </w:rPr>
-        <w:t>ValiPop program</w:t>
-      </w:r>
-      <w:r>
-        <w:rPr>
-          <w:lang w:val="en-GB"/>
-        </w:rPr>
-        <w:t xml:space="preserve"> refers to the ValiPop software executed.</w:t>
+    </w:p>
+    <w:p>
+      <w:pPr>
+        <w:pStyle w:val="Heading3"/>
+        <w:spacing w:after="240" w:line="360" w:lineRule="auto"/>
+        <w:jc w:val="both"/>
+        <w:rPr>
+          <w:color w:val="auto"/>
+          <w:lang w:val="en-GB"/>
+        </w:rPr>
+      </w:pPr>
+      <w:bookmarkStart w:id="14" w:name="primary-requirements"/>
+      <w:bookmarkStart w:id="15" w:name="_Toc194328028"/>
+      <w:r>
+        <w:rPr>
+          <w:color w:val="auto"/>
+          <w:lang w:val="en-GB"/>
+        </w:rPr>
+        <w:t xml:space="preserve">3.1 Primary </w:t>
+      </w:r>
+      <w:r>
+        <w:rPr>
+          <w:color w:val="auto"/>
+          <w:lang w:val="en-GB"/>
+        </w:rPr>
+        <w:t>R</w:t>
+      </w:r>
+      <w:r>
+        <w:rPr>
+          <w:color w:val="auto"/>
+          <w:lang w:val="en-GB"/>
+        </w:rPr>
+        <w:t>equirements</w:t>
+      </w:r>
+      <w:bookmarkEnd w:id="14"/>
+      <w:bookmarkEnd w:id="15"/>
+    </w:p>
+    <w:p>
+      <w:pPr>
+        <w:numPr>
+          <w:ilvl w:val="0"/>
+          <w:numId w:val="3"/>
+        </w:numPr>
+        <w:spacing w:line="360" w:lineRule="auto"/>
+        <w:jc w:val="both"/>
+        <w:rPr>
+          <w:lang w:val="en-GB"/>
+        </w:rPr>
+      </w:pPr>
+      <w:r>
+        <w:rPr>
+          <w:b/>
+          <w:lang w:val="en-GB"/>
+        </w:rPr>
+        <w:t>Pruning old data</w:t>
+      </w:r>
+      <w:r>
+        <w:rPr>
+          <w:lang w:val="en-GB"/>
+        </w:rPr>
+        <w:t>. The old ValiPop repository is closely related to the Ph.D. thesis it was developed with, containing many data files and results not relevant to a general user. The sample statistics provided by the repository should also be checked to have open licenses to avoid ethical concerns.</w:t>
+      </w:r>
+    </w:p>
+    <w:p>
+      <w:pPr>
+        <w:numPr>
+          <w:ilvl w:val="0"/>
+          <w:numId w:val="3"/>
+        </w:numPr>
+        <w:spacing w:line="360" w:lineRule="auto"/>
+        <w:jc w:val="both"/>
+        <w:rPr>
+          <w:lang w:val="en-GB"/>
+        </w:rPr>
+      </w:pPr>
+      <w:r>
+        <w:rPr>
+          <w:b/>
+          <w:lang w:val="en-GB"/>
+        </w:rPr>
+        <w:t>Decoupling the software from hardware</w:t>
+      </w:r>
+      <w:r>
+        <w:rPr>
+          <w:lang w:val="en-GB"/>
+        </w:rPr>
+        <w:t>. The old ValiPop program is tightly coupled to the local machine Dr. Dalton developed it with. It contains hardcoded paths, incompatible file names, and scripts not usable without Shell, which all should be modified to support users running ValiPop on any machine.</w:t>
+      </w:r>
+    </w:p>
+    <w:p>
+      <w:pPr>
+        <w:numPr>
+          <w:ilvl w:val="0"/>
+          <w:numId w:val="3"/>
+        </w:numPr>
+        <w:spacing w:line="360" w:lineRule="auto"/>
+        <w:jc w:val="both"/>
+        <w:rPr>
+          <w:lang w:val="en-GB"/>
+        </w:rPr>
+      </w:pPr>
+      <w:r>
+        <w:rPr>
+          <w:b/>
+          <w:lang w:val="en-GB"/>
+        </w:rPr>
+        <w:t>Creating a documented, single build artefact</w:t>
+      </w:r>
+      <w:r>
+        <w:rPr>
+          <w:lang w:val="en-GB"/>
+        </w:rPr>
+        <w:t>. Several undocumented steps are required to run the old ValiPop program. Ideally, the user should be able to run ValiPop through a single, well-documented interface. ValiPop should also have additional documentation on its configuration, results, and development.</w:t>
+      </w:r>
+    </w:p>
+    <w:p>
+      <w:pPr>
+        <w:numPr>
+          <w:ilvl w:val="0"/>
+          <w:numId w:val="3"/>
+        </w:numPr>
+        <w:spacing w:line="360" w:lineRule="auto"/>
+        <w:jc w:val="both"/>
+        <w:rPr>
+          <w:lang w:val="en-GB"/>
+        </w:rPr>
+      </w:pPr>
+      <w:r>
+        <w:rPr>
+          <w:b/>
+          <w:lang w:val="en-GB"/>
+        </w:rPr>
+        <w:t>Expanding the testing</w:t>
+      </w:r>
+      <w:r>
+        <w:rPr>
+          <w:lang w:val="en-GB"/>
+        </w:rPr>
+        <w:t xml:space="preserve">. The old ValiPop tests are no longer </w:t>
+      </w:r>
+      <w:r>
+        <w:rPr>
+          <w:lang w:val="en-GB"/>
+        </w:rPr>
+        <w:t>functional and</w:t>
+      </w:r>
+      <w:r>
+        <w:rPr>
+          <w:lang w:val="en-GB"/>
+        </w:rPr>
+        <w:t xml:space="preserve"> should be repaired and expanded to cover both the simulation and validation processes of ValiPop.</w:t>
+      </w:r>
+    </w:p>
+    <w:p>
+      <w:pPr>
+        <w:numPr>
+          <w:ilvl w:val="0"/>
+          <w:numId w:val="3"/>
+        </w:numPr>
+        <w:spacing w:line="360" w:lineRule="auto"/>
+        <w:jc w:val="both"/>
+        <w:rPr>
+          <w:lang w:val="en-GB"/>
+        </w:rPr>
+      </w:pPr>
+      <w:r>
+        <w:rPr>
+          <w:b/>
+          <w:lang w:val="en-GB"/>
+        </w:rPr>
+        <w:t>Restoring the simulation source code</w:t>
+      </w:r>
+      <w:r>
+        <w:rPr>
+          <w:lang w:val="en-GB"/>
+        </w:rPr>
+        <w:t>. Some features such as exporting populations to different file formats are invoked in tests but not callable by the user in the old ValiPop. These features should be restored and made accessible to users, and any existing bugs in the old ValiPop generally should be resolved also.</w:t>
+      </w:r>
+    </w:p>
+    <w:p>
+      <w:pPr>
+        <w:pStyle w:val="Heading3"/>
+        <w:spacing w:after="240" w:line="360" w:lineRule="auto"/>
+        <w:jc w:val="both"/>
+        <w:rPr>
+          <w:color w:val="auto"/>
+          <w:lang w:val="en-GB"/>
+        </w:rPr>
+      </w:pPr>
+      <w:bookmarkStart w:id="16" w:name="secondary-requirements"/>
+      <w:bookmarkStart w:id="17" w:name="_Toc194328029"/>
+      <w:r>
+        <w:rPr>
+          <w:color w:val="auto"/>
+          <w:lang w:val="en-GB"/>
+        </w:rPr>
+        <w:t xml:space="preserve">3.2. Secondary </w:t>
+      </w:r>
+      <w:r>
+        <w:rPr>
+          <w:color w:val="auto"/>
+          <w:lang w:val="en-GB"/>
+        </w:rPr>
+        <w:t>R</w:t>
+      </w:r>
+      <w:r>
+        <w:rPr>
+          <w:color w:val="auto"/>
+          <w:lang w:val="en-GB"/>
+        </w:rPr>
+        <w:t>equirements</w:t>
+      </w:r>
+      <w:bookmarkEnd w:id="16"/>
+      <w:bookmarkEnd w:id="17"/>
+    </w:p>
+    <w:p>
+      <w:pPr>
+        <w:numPr>
+          <w:ilvl w:val="0"/>
+          <w:numId w:val="4"/>
+        </w:numPr>
+        <w:spacing w:line="360" w:lineRule="auto"/>
+        <w:jc w:val="both"/>
+        <w:rPr>
+          <w:lang w:val="en-GB"/>
+        </w:rPr>
+      </w:pPr>
+      <w:r>
+        <w:rPr>
+          <w:b/>
+          <w:lang w:val="en-GB"/>
+        </w:rPr>
+        <w:t>Offering the build artefact</w:t>
+      </w:r>
+      <w:r>
+        <w:rPr>
+          <w:lang w:val="en-GB"/>
+        </w:rPr>
+        <w:t>. In the old ValiPop, users must clone, compile and execute the program to run it. Ideally, users should be able to download a pre-compiled artefact to run ValiPop easily.</w:t>
+      </w:r>
+    </w:p>
+    <w:p>
+      <w:pPr>
+        <w:numPr>
+          <w:ilvl w:val="0"/>
+          <w:numId w:val="4"/>
+        </w:numPr>
+        <w:spacing w:line="360" w:lineRule="auto"/>
+        <w:jc w:val="both"/>
+        <w:rPr>
+          <w:lang w:val="en-GB"/>
+        </w:rPr>
+      </w:pPr>
+      <w:r>
+        <w:rPr>
+          <w:b/>
+          <w:lang w:val="en-GB"/>
+        </w:rPr>
+        <w:t>Support additional output formats</w:t>
+      </w:r>
+      <w:r>
+        <w:rPr>
+          <w:lang w:val="en-GB"/>
+        </w:rPr>
+        <w:t>. In the old ValiPop, the generated population can be represented as records in tabular form, or potentially in some graph formats like GEDCOM. Adding additional formats for ValiPop to represent a population as would be a useful feature to make it more accessible.</w:t>
+      </w:r>
+    </w:p>
+    <w:p>
+      <w:pPr>
+        <w:numPr>
+          <w:ilvl w:val="0"/>
+          <w:numId w:val="4"/>
+        </w:numPr>
+        <w:spacing w:line="360" w:lineRule="auto"/>
+        <w:jc w:val="both"/>
+        <w:rPr>
+          <w:lang w:val="en-GB"/>
+        </w:rPr>
+      </w:pPr>
+      <w:r>
+        <w:rPr>
+          <w:b/>
+          <w:lang w:val="en-GB"/>
+        </w:rPr>
+        <w:t>Rewriting the validation code</w:t>
+      </w:r>
+      <w:r>
+        <w:rPr>
+          <w:lang w:val="en-GB"/>
+        </w:rPr>
+        <w:t>. Whilst the Old ValiPop simulation code is written in Java, the validation code is written separately in R. This complicates the maintenance and execution of the program, and ideally the validation should be rewritten to Java.</w:t>
+      </w:r>
+    </w:p>
+    <w:p>
+      <w:pPr>
+        <w:numPr>
+          <w:ilvl w:val="0"/>
+          <w:numId w:val="4"/>
+        </w:numPr>
+        <w:spacing w:line="360" w:lineRule="auto"/>
+        <w:jc w:val="both"/>
+        <w:rPr>
+          <w:lang w:val="en-GB"/>
+        </w:rPr>
+      </w:pPr>
+      <w:r>
+        <w:rPr>
+          <w:b/>
+          <w:lang w:val="en-GB"/>
+        </w:rPr>
+        <w:t>Expanding the population simulation</w:t>
+      </w:r>
+      <w:r>
+        <w:rPr>
+          <w:lang w:val="en-GB"/>
+        </w:rPr>
+        <w:t>. This entails adding additional features to the population simulation of the old ValiPop, such as more customisable parameters for the populations.</w:t>
+      </w:r>
+    </w:p>
+    <w:p>
+      <w:pPr>
+        <w:numPr>
+          <w:ilvl w:val="0"/>
+          <w:numId w:val="4"/>
+        </w:numPr>
+        <w:spacing w:line="360" w:lineRule="auto"/>
+        <w:jc w:val="both"/>
+        <w:rPr>
+          <w:lang w:val="en-GB"/>
+        </w:rPr>
+      </w:pPr>
+      <w:r>
+        <w:rPr>
+          <w:b/>
+          <w:lang w:val="en-GB"/>
+        </w:rPr>
+        <w:t>Improve the program interface</w:t>
+      </w:r>
+      <w:r>
+        <w:rPr>
+          <w:lang w:val="en-GB"/>
+        </w:rPr>
+        <w:t>. The old ValiPop can only be interacted with through invoking the necessary commands in a terminal. Creating a simple terminal or graphical user interface would help less technical users interact with the program more easily.</w:t>
       </w:r>
     </w:p>
     <w:p>
@@ -4318,7 +5659,7 @@
           <w:lang w:val="en-GB"/>
         </w:rPr>
       </w:pPr>
-      <w:bookmarkStart w:id="12" w:name="requirements-specification"/>
+      <w:bookmarkStart w:id="18" w:name="software-engineering-approach"/>
       <w:r>
         <w:rPr>
           <w:lang w:val="en-GB"/>
@@ -4336,16 +5677,16 @@
           <w:lang w:val="en-GB"/>
         </w:rPr>
       </w:pPr>
-      <w:bookmarkStart w:id="13" w:name="_Toc194328027"/>
-      <w:r>
-        <w:rPr>
-          <w:color w:val="auto"/>
-          <w:lang w:val="en-GB"/>
-        </w:rPr>
-        <w:t>3. Requirements Specification</w:t>
-      </w:r>
-      <w:bookmarkEnd w:id="12"/>
-      <w:bookmarkEnd w:id="13"/>
+      <w:bookmarkStart w:id="19" w:name="_Toc194328030"/>
+      <w:r>
+        <w:rPr>
+          <w:color w:val="auto"/>
+          <w:lang w:val="en-GB"/>
+        </w:rPr>
+        <w:t>4. Software Engineering Approach</w:t>
+      </w:r>
+      <w:bookmarkEnd w:id="18"/>
+      <w:bookmarkEnd w:id="19"/>
     </w:p>
     <w:p>
       <w:pPr>
@@ -4360,351 +5701,552 @@
         <w:rPr>
           <w:lang w:val="en-GB"/>
         </w:rPr>
-        <w:t>This chapter lists the original requirements as documented in the Description, Objectives, Ethics &amp; Resources (DOER) document submitted in the first semester.</w:t>
+        <w:t xml:space="preserve">This project is not a typical software development project as it focuses on restoring existing legacy code as opposed to developing my own software from scratch. Therefore, I took a more cautious approach when working on ValiPop as it was critical that the existing functionality was preserved. Consequently, my approach was divided into several steps which started small but were gradually built up. Each step of the approach summarises how I worked on ValiPop over time, and insight into the design decisions of my work is </w:t>
+      </w:r>
+      <w:r>
+        <w:rPr>
+          <w:lang w:val="en-GB"/>
+        </w:rPr>
+        <w:t>discussed</w:t>
+      </w:r>
+      <w:r>
+        <w:rPr>
+          <w:lang w:val="en-GB"/>
+        </w:rPr>
+        <w:t xml:space="preserve"> in the chapter </w:t>
+      </w:r>
+      <w:r>
+        <w:rPr>
+          <w:lang w:val="en-GB"/>
+        </w:rPr>
+        <w:t>[6].</w:t>
       </w:r>
     </w:p>
     <w:p>
       <w:pPr>
         <w:pStyle w:val="Heading3"/>
-        <w:spacing w:after="240" w:line="360" w:lineRule="auto"/>
-        <w:jc w:val="both"/>
-        <w:rPr>
-          <w:color w:val="auto"/>
-          <w:lang w:val="en-GB"/>
-        </w:rPr>
-      </w:pPr>
-      <w:bookmarkStart w:id="14" w:name="primary-requirements"/>
-      <w:bookmarkStart w:id="15" w:name="_Toc194328028"/>
-      <w:r>
-        <w:rPr>
-          <w:color w:val="auto"/>
-          <w:lang w:val="en-GB"/>
-        </w:rPr>
-        <w:t xml:space="preserve">3.1 Primary </w:t>
-      </w:r>
-      <w:r>
-        <w:rPr>
-          <w:color w:val="auto"/>
-          <w:lang w:val="en-GB"/>
-        </w:rPr>
-        <w:t>R</w:t>
-      </w:r>
-      <w:r>
-        <w:rPr>
-          <w:color w:val="auto"/>
-          <w:lang w:val="en-GB"/>
-        </w:rPr>
-        <w:t>equirements</w:t>
-      </w:r>
-      <w:bookmarkEnd w:id="14"/>
-      <w:bookmarkEnd w:id="15"/>
-    </w:p>
-    <w:p>
-      <w:pPr>
-        <w:numPr>
-          <w:ilvl w:val="0"/>
-          <w:numId w:val="3"/>
-        </w:numPr>
-        <w:spacing w:line="360" w:lineRule="auto"/>
-        <w:jc w:val="both"/>
-        <w:rPr>
-          <w:lang w:val="en-GB"/>
-        </w:rPr>
-      </w:pPr>
-      <w:r>
-        <w:rPr>
-          <w:b/>
-          <w:lang w:val="en-GB"/>
-        </w:rPr>
-        <w:t>Pruning old data</w:t>
-      </w:r>
-      <w:r>
-        <w:rPr>
-          <w:lang w:val="en-GB"/>
-        </w:rPr>
-        <w:t>. The old ValiPop repository is closely related to the Ph.D. thesis it was developed with, containing many data files and results not relevant to a general user. The sample statistics provided by the repository should also be checked to have open licenses to avoid ethical concerns.</w:t>
-      </w:r>
-    </w:p>
-    <w:p>
-      <w:pPr>
-        <w:numPr>
-          <w:ilvl w:val="0"/>
-          <w:numId w:val="3"/>
-        </w:numPr>
-        <w:spacing w:line="360" w:lineRule="auto"/>
-        <w:jc w:val="both"/>
-        <w:rPr>
-          <w:lang w:val="en-GB"/>
-        </w:rPr>
-      </w:pPr>
-      <w:r>
-        <w:rPr>
-          <w:b/>
-          <w:lang w:val="en-GB"/>
-        </w:rPr>
-        <w:t>Decoupling the software from hardware</w:t>
-      </w:r>
-      <w:r>
-        <w:rPr>
-          <w:lang w:val="en-GB"/>
-        </w:rPr>
-        <w:t>. The old ValiPop program is tightly coupled to the local machine Dr. Dalton developed it with. It contains hardcoded paths, incompatible file names, and scripts not usable without Shell, which all should be modified to support users running ValiPop on any machine.</w:t>
-      </w:r>
-    </w:p>
-    <w:p>
-      <w:pPr>
-        <w:numPr>
-          <w:ilvl w:val="0"/>
-          <w:numId w:val="3"/>
-        </w:numPr>
-        <w:spacing w:line="360" w:lineRule="auto"/>
-        <w:jc w:val="both"/>
-        <w:rPr>
-          <w:lang w:val="en-GB"/>
-        </w:rPr>
-      </w:pPr>
-      <w:r>
-        <w:rPr>
-          <w:b/>
-          <w:lang w:val="en-GB"/>
-        </w:rPr>
-        <w:t>Creating a documented, single build artefact</w:t>
-      </w:r>
-      <w:r>
-        <w:rPr>
-          <w:lang w:val="en-GB"/>
-        </w:rPr>
-        <w:t>. Several undocumented steps are required to run the old ValiPop program. Ideally, the user should be able to run ValiPop through a single, well-documented interface. ValiPop should also have additional documentation on its configuration, results, and development.</w:t>
-      </w:r>
-    </w:p>
-    <w:p>
-      <w:pPr>
-        <w:numPr>
-          <w:ilvl w:val="0"/>
-          <w:numId w:val="3"/>
-        </w:numPr>
-        <w:spacing w:line="360" w:lineRule="auto"/>
-        <w:jc w:val="both"/>
-        <w:rPr>
-          <w:lang w:val="en-GB"/>
-        </w:rPr>
-      </w:pPr>
-      <w:r>
-        <w:rPr>
-          <w:b/>
-          <w:lang w:val="en-GB"/>
-        </w:rPr>
-        <w:t>Expanding the testing</w:t>
-      </w:r>
-      <w:r>
-        <w:rPr>
-          <w:lang w:val="en-GB"/>
-        </w:rPr>
-        <w:t xml:space="preserve">. The old ValiPop tests are no longer </w:t>
-      </w:r>
-      <w:r>
-        <w:rPr>
-          <w:lang w:val="en-GB"/>
-        </w:rPr>
-        <w:t>functional and</w:t>
-      </w:r>
-      <w:r>
-        <w:rPr>
-          <w:lang w:val="en-GB"/>
-        </w:rPr>
-        <w:t xml:space="preserve"> should be repaired and expanded to cover both the simulation and validation processes of ValiPop.</w:t>
-      </w:r>
-    </w:p>
-    <w:p>
-      <w:pPr>
-        <w:numPr>
-          <w:ilvl w:val="0"/>
-          <w:numId w:val="3"/>
-        </w:numPr>
-        <w:spacing w:line="360" w:lineRule="auto"/>
-        <w:jc w:val="both"/>
-        <w:rPr>
-          <w:lang w:val="en-GB"/>
-        </w:rPr>
-      </w:pPr>
-      <w:r>
-        <w:rPr>
-          <w:b/>
-          <w:lang w:val="en-GB"/>
-        </w:rPr>
-        <w:t>Restoring the simulation source code</w:t>
-      </w:r>
-      <w:r>
-        <w:rPr>
-          <w:lang w:val="en-GB"/>
-        </w:rPr>
-        <w:t>. Some features such as exporting populations to different file formats are invoked in tests but not callable by the user in the old ValiPop. These features should be restored and made accessible to users, and any existing bugs in the old ValiPop generally should be resolved also.</w:t>
+        <w:spacing w:line="360" w:lineRule="auto"/>
+        <w:jc w:val="both"/>
+        <w:rPr>
+          <w:color w:val="auto"/>
+          <w:lang w:val="en-GB"/>
+        </w:rPr>
+      </w:pPr>
+      <w:bookmarkStart w:id="20" w:name="study-the-code"/>
+      <w:bookmarkStart w:id="21" w:name="_Toc194328031"/>
+      <w:r>
+        <w:rPr>
+          <w:color w:val="auto"/>
+          <w:lang w:val="en-GB"/>
+        </w:rPr>
+        <w:t xml:space="preserve">4.1. Study the </w:t>
+      </w:r>
+      <w:r>
+        <w:rPr>
+          <w:color w:val="auto"/>
+          <w:lang w:val="en-GB"/>
+        </w:rPr>
+        <w:t>C</w:t>
+      </w:r>
+      <w:r>
+        <w:rPr>
+          <w:color w:val="auto"/>
+          <w:lang w:val="en-GB"/>
+        </w:rPr>
+        <w:t>ode</w:t>
+      </w:r>
+      <w:bookmarkEnd w:id="20"/>
+      <w:bookmarkEnd w:id="21"/>
+    </w:p>
+    <w:p>
+      <w:pPr>
+        <w:pStyle w:val="FirstParagraph"/>
+        <w:spacing w:line="360" w:lineRule="auto"/>
+        <w:jc w:val="both"/>
+        <w:rPr>
+          <w:lang w:val="en-GB"/>
+        </w:rPr>
+      </w:pPr>
+      <w:r>
+        <w:rPr>
+          <w:lang w:val="en-GB"/>
+        </w:rPr>
+        <w:t>The first step was to determine the state of the old ValiPop program and identify how it operated. The existing documentation included with the old ValiPop seemed out-of-date, so I resulted to reading through the source code to gather an understanding of the execution flow. Reading Dr. Dalton’s thesis also provided insight into many features of the old ValiPop such as the options supported during execution. Once I had a rudimentary understanding of the program, I met with Dr. Dalton in-person to clarify additional details such as the statistics behind the population validation.</w:t>
       </w:r>
     </w:p>
     <w:p>
       <w:pPr>
         <w:pStyle w:val="Heading3"/>
-        <w:spacing w:after="240" w:line="360" w:lineRule="auto"/>
-        <w:jc w:val="both"/>
-        <w:rPr>
-          <w:color w:val="auto"/>
-          <w:lang w:val="en-GB"/>
-        </w:rPr>
-      </w:pPr>
-      <w:bookmarkStart w:id="16" w:name="secondary-requirements"/>
-      <w:bookmarkStart w:id="17" w:name="_Toc194328029"/>
-      <w:r>
-        <w:rPr>
-          <w:color w:val="auto"/>
-          <w:lang w:val="en-GB"/>
-        </w:rPr>
-        <w:t xml:space="preserve">3.2. Secondary </w:t>
-      </w:r>
-      <w:r>
-        <w:rPr>
-          <w:color w:val="auto"/>
-          <w:lang w:val="en-GB"/>
-        </w:rPr>
-        <w:t>R</w:t>
-      </w:r>
-      <w:r>
-        <w:rPr>
-          <w:color w:val="auto"/>
-          <w:lang w:val="en-GB"/>
-        </w:rPr>
-        <w:t>equirements</w:t>
-      </w:r>
-      <w:bookmarkEnd w:id="16"/>
-      <w:bookmarkEnd w:id="17"/>
-    </w:p>
-    <w:p>
-      <w:pPr>
-        <w:numPr>
-          <w:ilvl w:val="0"/>
-          <w:numId w:val="4"/>
-        </w:numPr>
-        <w:spacing w:line="360" w:lineRule="auto"/>
-        <w:jc w:val="both"/>
-        <w:rPr>
-          <w:lang w:val="en-GB"/>
-        </w:rPr>
-      </w:pPr>
-      <w:r>
-        <w:rPr>
-          <w:b/>
-          <w:lang w:val="en-GB"/>
-        </w:rPr>
-        <w:t>Offering the build artefact</w:t>
-      </w:r>
-      <w:r>
-        <w:rPr>
-          <w:lang w:val="en-GB"/>
-        </w:rPr>
-        <w:t>. In the old ValiPop, users must clone, compile and execute the program to run it. Ideally, users should be able to download a pre-compiled artefact to run ValiPop easily.</w:t>
-      </w:r>
-    </w:p>
-    <w:p>
-      <w:pPr>
-        <w:numPr>
-          <w:ilvl w:val="0"/>
-          <w:numId w:val="4"/>
-        </w:numPr>
-        <w:spacing w:line="360" w:lineRule="auto"/>
-        <w:jc w:val="both"/>
-        <w:rPr>
-          <w:lang w:val="en-GB"/>
-        </w:rPr>
-      </w:pPr>
-      <w:r>
-        <w:rPr>
-          <w:b/>
-          <w:lang w:val="en-GB"/>
-        </w:rPr>
-        <w:t>Support additional output formats</w:t>
-      </w:r>
-      <w:r>
-        <w:rPr>
-          <w:lang w:val="en-GB"/>
-        </w:rPr>
-        <w:t>. In the old ValiPop, the generated population can be represented as records in tabular form, or potentially in some graph formats like GEDCOM. Adding additional formats for ValiPop to represent a population as would be a useful feature to make it more accessible.</w:t>
-      </w:r>
-    </w:p>
-    <w:p>
-      <w:pPr>
-        <w:numPr>
-          <w:ilvl w:val="0"/>
-          <w:numId w:val="4"/>
-        </w:numPr>
-        <w:spacing w:line="360" w:lineRule="auto"/>
-        <w:jc w:val="both"/>
-        <w:rPr>
-          <w:lang w:val="en-GB"/>
-        </w:rPr>
-      </w:pPr>
-      <w:r>
-        <w:rPr>
-          <w:b/>
-          <w:lang w:val="en-GB"/>
-        </w:rPr>
-        <w:t>Rewriting the validation code</w:t>
-      </w:r>
-      <w:r>
-        <w:rPr>
-          <w:lang w:val="en-GB"/>
-        </w:rPr>
-        <w:t>. Whilst the Old ValiPop simulation code is written in Java, the validation code is written separately in R. This complicates the maintenance and execution of the program, and ideally the validation should be rewritten to Java.</w:t>
-      </w:r>
-    </w:p>
-    <w:p>
-      <w:pPr>
-        <w:numPr>
-          <w:ilvl w:val="0"/>
-          <w:numId w:val="4"/>
-        </w:numPr>
-        <w:spacing w:line="360" w:lineRule="auto"/>
-        <w:jc w:val="both"/>
-        <w:rPr>
-          <w:lang w:val="en-GB"/>
-        </w:rPr>
-      </w:pPr>
-      <w:r>
-        <w:rPr>
-          <w:b/>
-          <w:lang w:val="en-GB"/>
-        </w:rPr>
-        <w:t>Expanding the population simulation</w:t>
-      </w:r>
-      <w:r>
-        <w:rPr>
-          <w:lang w:val="en-GB"/>
-        </w:rPr>
-        <w:t>. This entails adding additional features to the population simulation of the old ValiPop, such as more customisable parameters for the populations.</w:t>
-      </w:r>
-    </w:p>
-    <w:p>
-      <w:pPr>
-        <w:numPr>
-          <w:ilvl w:val="0"/>
-          <w:numId w:val="4"/>
-        </w:numPr>
-        <w:spacing w:line="360" w:lineRule="auto"/>
-        <w:jc w:val="both"/>
-        <w:rPr>
-          <w:lang w:val="en-GB"/>
-        </w:rPr>
-      </w:pPr>
-      <w:r>
-        <w:rPr>
-          <w:b/>
-          <w:lang w:val="en-GB"/>
-        </w:rPr>
-        <w:t>Improve the program interface</w:t>
-      </w:r>
-      <w:r>
-        <w:rPr>
-          <w:lang w:val="en-GB"/>
-        </w:rPr>
-        <w:t>. The old ValiPop can only be interacted with through invoking the necessary commands in a terminal. Creating a simple terminal or graphical user interface would help less technical users interact with the program more easily.</w:t>
+        <w:spacing w:line="360" w:lineRule="auto"/>
+        <w:jc w:val="both"/>
+        <w:rPr>
+          <w:color w:val="auto"/>
+          <w:lang w:val="en-GB"/>
+        </w:rPr>
+      </w:pPr>
+      <w:bookmarkStart w:id="22" w:name="execute-the-program"/>
+      <w:bookmarkStart w:id="23" w:name="_Toc194328032"/>
+      <w:r>
+        <w:rPr>
+          <w:color w:val="auto"/>
+          <w:lang w:val="en-GB"/>
+        </w:rPr>
+        <w:t xml:space="preserve">4.2. Execute the </w:t>
+      </w:r>
+      <w:r>
+        <w:rPr>
+          <w:color w:val="auto"/>
+          <w:lang w:val="en-GB"/>
+        </w:rPr>
+        <w:t>P</w:t>
+      </w:r>
+      <w:r>
+        <w:rPr>
+          <w:color w:val="auto"/>
+          <w:lang w:val="en-GB"/>
+        </w:rPr>
+        <w:t>rogram</w:t>
+      </w:r>
+      <w:bookmarkEnd w:id="22"/>
+      <w:bookmarkEnd w:id="23"/>
+    </w:p>
+    <w:p>
+      <w:pPr>
+        <w:pStyle w:val="FirstParagraph"/>
+        <w:spacing w:line="360" w:lineRule="auto"/>
+        <w:jc w:val="both"/>
+        <w:rPr>
+          <w:lang w:val="en-GB"/>
+        </w:rPr>
+      </w:pPr>
+      <w:r>
+        <w:rPr>
+          <w:lang w:val="en-GB"/>
+        </w:rPr>
+        <w:t>Once I had a decent understanding of the old ValiPop, I attempted to execute the program. This included identifying and installing the necessary dependencies, modifying the source code to support execution on my machine, and fixing any errors that occurred during the process. With each attempt at running ValiPop, I needed to ensure the generated population was validated and written to records correctly.</w:t>
+      </w:r>
+    </w:p>
+    <w:p>
+      <w:pPr>
+        <w:pStyle w:val="Heading3"/>
+        <w:spacing w:line="360" w:lineRule="auto"/>
+        <w:jc w:val="both"/>
+        <w:rPr>
+          <w:lang w:val="en-GB"/>
+        </w:rPr>
+      </w:pPr>
+      <w:bookmarkStart w:id="24" w:name="simplify-execution"/>
+      <w:bookmarkStart w:id="25" w:name="_Toc194328033"/>
+      <w:r>
+        <w:rPr>
+          <w:color w:val="auto"/>
+          <w:lang w:val="en-GB"/>
+        </w:rPr>
+        <w:t xml:space="preserve">4.3. Simplify </w:t>
+      </w:r>
+      <w:r>
+        <w:rPr>
+          <w:color w:val="auto"/>
+          <w:lang w:val="en-GB"/>
+        </w:rPr>
+        <w:t>E</w:t>
+      </w:r>
+      <w:r>
+        <w:rPr>
+          <w:color w:val="auto"/>
+          <w:lang w:val="en-GB"/>
+        </w:rPr>
+        <w:t>xecution</w:t>
+      </w:r>
+      <w:bookmarkEnd w:id="24"/>
+      <w:bookmarkEnd w:id="25"/>
+    </w:p>
+    <w:p>
+      <w:pPr>
+        <w:pStyle w:val="FirstParagraph"/>
+        <w:spacing w:line="360" w:lineRule="auto"/>
+        <w:jc w:val="both"/>
+        <w:rPr>
+          <w:lang w:val="en-GB"/>
+        </w:rPr>
+      </w:pPr>
+      <w:r>
+        <w:rPr>
+          <w:lang w:val="en-GB"/>
+        </w:rPr>
+        <w:t xml:space="preserve">After successful running ValiPop on my machine, I proceeded to </w:t>
+      </w:r>
+      <w:r>
+        <w:rPr>
+          <w:lang w:val="en-GB"/>
+        </w:rPr>
+        <w:t>make</w:t>
+      </w:r>
+      <w:r>
+        <w:rPr>
+          <w:lang w:val="en-GB"/>
+        </w:rPr>
+        <w:t xml:space="preserve"> it more easily executable. I identified and removed unnecessary dependencies, as well as created a virtual environment to aid in installing the R dependencies. I additionally replaced hard-coded file paths with configurable paths, eventually being able to build and execute ValiPop on any Unix-like machine in a few steps.</w:t>
+      </w:r>
+    </w:p>
+    <w:p>
+      <w:pPr>
+        <w:pStyle w:val="BodyText"/>
+        <w:spacing w:line="360" w:lineRule="auto"/>
+        <w:jc w:val="both"/>
+        <w:rPr>
+          <w:lang w:val="en-GB"/>
+        </w:rPr>
+      </w:pPr>
+      <w:r>
+        <w:rPr>
+          <w:lang w:val="en-GB"/>
+        </w:rPr>
+        <w:t>To support running ValiPop on other operating systems like Windows, I later containerised the compilation and execution of ValiPop. Eventually, I was also able to integrate the external scripts used by ValiPop, allowing for it to run locally on Windows also.</w:t>
+      </w:r>
+    </w:p>
+    <w:p>
+      <w:pPr>
+        <w:pStyle w:val="Heading3"/>
+        <w:spacing w:line="360" w:lineRule="auto"/>
+        <w:jc w:val="both"/>
+        <w:rPr>
+          <w:color w:val="auto"/>
+          <w:lang w:val="en-GB"/>
+        </w:rPr>
+      </w:pPr>
+      <w:bookmarkStart w:id="26" w:name="simplify-development"/>
+      <w:bookmarkStart w:id="27" w:name="_Toc194328034"/>
+      <w:r>
+        <w:rPr>
+          <w:color w:val="auto"/>
+          <w:lang w:val="en-GB"/>
+        </w:rPr>
+        <w:t xml:space="preserve">4.4. Simplify </w:t>
+      </w:r>
+      <w:r>
+        <w:rPr>
+          <w:color w:val="auto"/>
+          <w:lang w:val="en-GB"/>
+        </w:rPr>
+        <w:t>D</w:t>
+      </w:r>
+      <w:r>
+        <w:rPr>
+          <w:color w:val="auto"/>
+          <w:lang w:val="en-GB"/>
+        </w:rPr>
+        <w:t>evelopment</w:t>
+      </w:r>
+      <w:bookmarkEnd w:id="26"/>
+      <w:bookmarkEnd w:id="27"/>
+    </w:p>
+    <w:p>
+      <w:pPr>
+        <w:pStyle w:val="FirstParagraph"/>
+        <w:spacing w:line="360" w:lineRule="auto"/>
+        <w:jc w:val="both"/>
+        <w:rPr>
+          <w:lang w:val="en-GB"/>
+        </w:rPr>
+      </w:pPr>
+      <w:r>
+        <w:rPr>
+          <w:lang w:val="en-GB"/>
+        </w:rPr>
+        <w:t xml:space="preserve">Once I could execute ValiPop more easily, I focused on restoring the testing. The tests were initially broken for the old </w:t>
+      </w:r>
+      <w:r>
+        <w:rPr>
+          <w:lang w:val="en-GB"/>
+        </w:rPr>
+        <w:t>ValiPop;</w:t>
+      </w:r>
+      <w:r>
+        <w:rPr>
+          <w:lang w:val="en-GB"/>
+        </w:rPr>
+        <w:t xml:space="preserve"> </w:t>
+      </w:r>
+      <w:r>
+        <w:rPr>
+          <w:lang w:val="en-GB"/>
+        </w:rPr>
+        <w:t>however,</w:t>
+      </w:r>
+      <w:r>
+        <w:rPr>
+          <w:lang w:val="en-GB"/>
+        </w:rPr>
+        <w:t xml:space="preserve"> I managed to recover them by fixing the problematic dependencies. Once restored, I implemented end-to-end tests which ensured ValiPop returned the same output given some input. This then allowed me to refactor and simplify sections of ValiPop whilst guaranteeing the same functionality.</w:t>
+      </w:r>
+    </w:p>
+    <w:p>
+      <w:pPr>
+        <w:pStyle w:val="Heading3"/>
+        <w:spacing w:line="360" w:lineRule="auto"/>
+        <w:jc w:val="both"/>
+        <w:rPr>
+          <w:color w:val="auto"/>
+          <w:lang w:val="en-GB"/>
+        </w:rPr>
+      </w:pPr>
+      <w:bookmarkStart w:id="28" w:name="integrate-features"/>
+      <w:bookmarkStart w:id="29" w:name="_Toc194328035"/>
+      <w:r>
+        <w:rPr>
+          <w:color w:val="auto"/>
+          <w:lang w:val="en-GB"/>
+        </w:rPr>
+        <w:t xml:space="preserve">4.5. Integrate </w:t>
+      </w:r>
+      <w:r>
+        <w:rPr>
+          <w:color w:val="auto"/>
+          <w:lang w:val="en-GB"/>
+        </w:rPr>
+        <w:t>F</w:t>
+      </w:r>
+      <w:r>
+        <w:rPr>
+          <w:color w:val="auto"/>
+          <w:lang w:val="en-GB"/>
+        </w:rPr>
+        <w:t>eatures</w:t>
+      </w:r>
+      <w:bookmarkEnd w:id="28"/>
+      <w:bookmarkEnd w:id="29"/>
+    </w:p>
+    <w:p>
+      <w:pPr>
+        <w:pStyle w:val="FirstParagraph"/>
+        <w:spacing w:line="360" w:lineRule="auto"/>
+        <w:jc w:val="both"/>
+        <w:rPr>
+          <w:lang w:val="en-GB"/>
+        </w:rPr>
+      </w:pPr>
+      <w:r>
+        <w:rPr>
+          <w:lang w:val="en-GB"/>
+        </w:rPr>
+        <w:t>With some additional testing established, I then worked on integrating additional features which improve the user experience of ValiPop. This included integrating the additional output formats, like GEDCOM which was already implemented, into the main program to be accessible by the user. I also added additional error handling when reading input to help users identify mistakes in their input configurations. Notably, whilst implementing error handling, I identified and fixed several bugs caused by unusual configuration options.</w:t>
+      </w:r>
+    </w:p>
+    <w:p>
+      <w:pPr>
+        <w:pStyle w:val="Heading3"/>
+        <w:spacing w:line="360" w:lineRule="auto"/>
+        <w:jc w:val="both"/>
+        <w:rPr>
+          <w:color w:val="auto"/>
+          <w:lang w:val="en-GB"/>
+        </w:rPr>
+      </w:pPr>
+      <w:bookmarkStart w:id="30" w:name="documentation"/>
+      <w:bookmarkStart w:id="31" w:name="_Toc194328036"/>
+      <w:r>
+        <w:rPr>
+          <w:color w:val="auto"/>
+          <w:lang w:val="en-GB"/>
+        </w:rPr>
+        <w:t>4.6. Documentation</w:t>
+      </w:r>
+      <w:bookmarkEnd w:id="30"/>
+      <w:bookmarkEnd w:id="31"/>
+    </w:p>
+    <w:p>
+      <w:pPr>
+        <w:pStyle w:val="FirstParagraph"/>
+        <w:spacing w:line="360" w:lineRule="auto"/>
+        <w:jc w:val="both"/>
+        <w:rPr>
+          <w:lang w:val="en-GB"/>
+        </w:rPr>
+      </w:pPr>
+      <w:r>
+        <w:rPr>
+          <w:lang w:val="en-GB"/>
+        </w:rPr>
+        <w:t xml:space="preserve">Throughout my software engineering approach, I wrote documentation about ValiPop. Whilst studying the code of the old ValiPop, I documented what I learned in the form of </w:t>
+      </w:r>
+      <w:r>
+        <w:rPr>
+          <w:lang w:val="en-GB"/>
+        </w:rPr>
+        <w:t>Javadoc</w:t>
+      </w:r>
+      <w:r>
+        <w:rPr>
+          <w:lang w:val="en-GB"/>
+        </w:rPr>
+        <w:t xml:space="preserve">. I also hosted additional documentation from the </w:t>
+      </w:r>
+      <w:r>
+        <w:rPr>
+          <w:lang w:val="en-GB"/>
+        </w:rPr>
+        <w:t>GitHub</w:t>
+      </w:r>
+      <w:r>
+        <w:rPr>
+          <w:lang w:val="en-GB"/>
+        </w:rPr>
+        <w:t xml:space="preserve"> repository, detailing the steps to compile and execute ValiPop both locally and with a container. To document the configuration options, input statistics, and results, I included reference sheets in the hosted documentation which explain each aspect briefly.</w:t>
+      </w:r>
+      <w:r>
+        <w:rPr>
+          <w:lang w:val="en-GB"/>
+        </w:rPr>
+        <w:t xml:space="preserve"> </w:t>
+      </w:r>
+      <w:r>
+        <w:rPr>
+          <w:lang w:val="en-GB"/>
+        </w:rPr>
+        <w:t>To support the future development of ValiPop, I also wrote documentation explaining how each section of ValiPop operates and how each input is used internally.</w:t>
+      </w:r>
+      <w:bookmarkStart w:id="32" w:name="ethics"/>
+    </w:p>
+    <w:p>
+      <w:pPr>
+        <w:pStyle w:val="Heading2"/>
+        <w:spacing w:line="360" w:lineRule="auto"/>
+        <w:jc w:val="both"/>
+        <w:rPr>
+          <w:color w:val="auto"/>
+          <w:lang w:val="en-GB"/>
+        </w:rPr>
+      </w:pPr>
+      <w:bookmarkStart w:id="33" w:name="_Toc194328037"/>
+      <w:r>
+        <w:rPr>
+          <w:color w:val="auto"/>
+          <w:lang w:val="en-GB"/>
+        </w:rPr>
+        <w:t>5. Ethics</w:t>
+      </w:r>
+      <w:bookmarkEnd w:id="32"/>
+      <w:bookmarkEnd w:id="33"/>
+    </w:p>
+    <w:p>
+      <w:pPr>
+        <w:pStyle w:val="FirstParagraph"/>
+        <w:spacing w:line="360" w:lineRule="auto"/>
+        <w:jc w:val="both"/>
+        <w:rPr>
+          <w:lang w:val="en-GB"/>
+        </w:rPr>
+      </w:pPr>
+      <w:r>
+        <w:rPr>
+          <w:lang w:val="en-GB"/>
+        </w:rPr>
+        <w:t>The genealogical populations generated by ValiPop are completely fabricated based on the input statistics provided, and do not reflect any real families or individuals. The input statistics provided by the ValiPop repository should also be publicly available to use and redistribute. Therefore, I believe this project did not raise any ethical issues and I completed a preliminary ethics self-assessment form to confirm this.</w:t>
+      </w:r>
+    </w:p>
+    <w:p>
+      <w:pPr>
+        <w:pStyle w:val="BodyText"/>
+        <w:spacing w:line="360" w:lineRule="auto"/>
+        <w:jc w:val="both"/>
+        <w:rPr>
+          <w:lang w:val="en-GB"/>
+        </w:rPr>
+      </w:pPr>
+      <w:r>
+        <w:rPr>
+          <w:lang w:val="en-GB"/>
+        </w:rPr>
+        <w:t>However, upon examining the input statistics included with the old ValiPop</w:t>
+      </w:r>
+      <w:r>
+        <w:rPr>
+          <w:lang w:val="en-GB"/>
+        </w:rPr>
+        <w:t xml:space="preserve"> repository</w:t>
+      </w:r>
+      <w:r>
+        <w:rPr>
+          <w:lang w:val="en-GB"/>
+        </w:rPr>
+        <w:t xml:space="preserve">, I identified six statistics which did not allow redistribution or public usage. Three distributions providing probabilities for historical British forenames and surnames </w:t>
+      </w:r>
+      <w:r>
+        <w:rPr>
+          <w:lang w:val="en-GB"/>
+        </w:rPr>
+        <w:t xml:space="preserve">and </w:t>
+      </w:r>
+      <w:r>
+        <w:rPr>
+          <w:lang w:val="en-GB"/>
+        </w:rPr>
+        <w:t>were retrieved from the North Atlantic Population Project (NAPP), which grants a limited license which prevent</w:t>
+      </w:r>
+      <w:r>
+        <w:rPr>
+          <w:lang w:val="en-GB"/>
+        </w:rPr>
+        <w:t>s</w:t>
+      </w:r>
+      <w:r>
+        <w:rPr>
+          <w:lang w:val="en-GB"/>
+        </w:rPr>
+        <w:t xml:space="preserve"> redistributing the data (Minnesota Population </w:t>
+      </w:r>
+      <w:proofErr w:type="spellStart"/>
+      <w:r>
+        <w:rPr>
+          <w:lang w:val="en-GB"/>
+        </w:rPr>
+        <w:t>Center</w:t>
+      </w:r>
+      <w:proofErr w:type="spellEnd"/>
+      <w:r>
+        <w:rPr>
+          <w:lang w:val="en-GB"/>
+        </w:rPr>
+        <w:t xml:space="preserve"> and University of Minnesota, 2025). The remaining three distributions provided probabilities for Dominican forenames and Spanish surnames and appeared to be from the parenting websites parenting.firstcry.com and familyeducation.com. However, both websites specify in their terms of use that the materials are copyrighted (Firstcry.com, 2025) (FEN, 2025).</w:t>
+      </w:r>
+    </w:p>
+    <w:p>
+      <w:pPr>
+        <w:pStyle w:val="BodyText"/>
+        <w:spacing w:line="360" w:lineRule="auto"/>
+        <w:jc w:val="both"/>
+        <w:rPr>
+          <w:lang w:val="en-GB"/>
+        </w:rPr>
+      </w:pPr>
+      <w:r>
+        <w:rPr>
+          <w:lang w:val="en-GB"/>
+        </w:rPr>
+        <w:t xml:space="preserve">To ensure the ValiPop repository only included open and redistributable data, I removed all instances of these statistics from the git commit history. The forename statistics were then replaced with open data retrieved from the Office for National Statistics (ONS), and the surnames statistics were replaced with data retrieved from the National Records of Scotland (NRS). Moreover, I included a file correctly citing and referencing the usage rights of each source among all the input statistics at </w:t>
+      </w:r>
+      <w:proofErr w:type="spellStart"/>
+      <w:r>
+        <w:rPr>
+          <w:rStyle w:val="VerbatimChar"/>
+          <w:lang w:val="en-GB"/>
+        </w:rPr>
+        <w:t>src</w:t>
+      </w:r>
+      <w:proofErr w:type="spellEnd"/>
+      <w:r>
+        <w:rPr>
+          <w:rStyle w:val="VerbatimChar"/>
+          <w:lang w:val="en-GB"/>
+        </w:rPr>
+        <w:t>/main/resources/inputs/usage.md</w:t>
+      </w:r>
+      <w:r>
+        <w:rPr>
+          <w:lang w:val="en-GB"/>
+        </w:rPr>
+        <w:t>.</w:t>
       </w:r>
     </w:p>
     <w:p>
@@ -4718,584 +6260,6 @@
           <w:lang w:val="en-GB"/>
         </w:rPr>
       </w:pPr>
-      <w:bookmarkStart w:id="18" w:name="software-engineering-approach"/>
-      <w:r>
-        <w:rPr>
-          <w:lang w:val="en-GB"/>
-        </w:rPr>
-        <w:br w:type="page"/>
-      </w:r>
-    </w:p>
-    <w:p>
-      <w:pPr>
-        <w:pStyle w:val="Heading2"/>
-        <w:spacing w:line="360" w:lineRule="auto"/>
-        <w:jc w:val="both"/>
-        <w:rPr>
-          <w:color w:val="auto"/>
-          <w:lang w:val="en-GB"/>
-        </w:rPr>
-      </w:pPr>
-      <w:bookmarkStart w:id="19" w:name="_Toc194328030"/>
-      <w:r>
-        <w:rPr>
-          <w:color w:val="auto"/>
-          <w:lang w:val="en-GB"/>
-        </w:rPr>
-        <w:t>4. Software Engineering Approach</w:t>
-      </w:r>
-      <w:bookmarkEnd w:id="18"/>
-      <w:bookmarkEnd w:id="19"/>
-    </w:p>
-    <w:p>
-      <w:pPr>
-        <w:pStyle w:val="FirstParagraph"/>
-        <w:spacing w:line="360" w:lineRule="auto"/>
-        <w:jc w:val="both"/>
-        <w:rPr>
-          <w:lang w:val="en-GB"/>
-        </w:rPr>
-      </w:pPr>
-      <w:r>
-        <w:rPr>
-          <w:lang w:val="en-GB"/>
-        </w:rPr>
-        <w:t xml:space="preserve">This project is not a typical software development project as it focuses on restoring existing legacy code as opposed to developing my own software from scratch. Therefore, I took a more cautious approach when working on ValiPop as it was critical that the existing functionality was preserved. Consequently, my approach was divided into several steps which started small but were gradually built up. Each step of the approach summarises how I worked on ValiPop over time, and insight into the design decisions of my work is </w:t>
-      </w:r>
-      <w:r>
-        <w:rPr>
-          <w:lang w:val="en-GB"/>
-        </w:rPr>
-        <w:t>discussed</w:t>
-      </w:r>
-      <w:r>
-        <w:rPr>
-          <w:lang w:val="en-GB"/>
-        </w:rPr>
-        <w:t xml:space="preserve"> in the chapter </w:t>
-      </w:r>
-      <w:r>
-        <w:rPr>
-          <w:lang w:val="en-GB"/>
-        </w:rPr>
-        <w:t>[6].</w:t>
-      </w:r>
-    </w:p>
-    <w:p>
-      <w:pPr>
-        <w:pStyle w:val="Heading3"/>
-        <w:spacing w:line="360" w:lineRule="auto"/>
-        <w:jc w:val="both"/>
-        <w:rPr>
-          <w:color w:val="auto"/>
-          <w:lang w:val="en-GB"/>
-        </w:rPr>
-      </w:pPr>
-      <w:bookmarkStart w:id="20" w:name="study-the-code"/>
-      <w:bookmarkStart w:id="21" w:name="_Toc194328031"/>
-      <w:r>
-        <w:rPr>
-          <w:color w:val="auto"/>
-          <w:lang w:val="en-GB"/>
-        </w:rPr>
-        <w:t xml:space="preserve">4.1. Study the </w:t>
-      </w:r>
-      <w:r>
-        <w:rPr>
-          <w:color w:val="auto"/>
-          <w:lang w:val="en-GB"/>
-        </w:rPr>
-        <w:t>C</w:t>
-      </w:r>
-      <w:r>
-        <w:rPr>
-          <w:color w:val="auto"/>
-          <w:lang w:val="en-GB"/>
-        </w:rPr>
-        <w:t>ode</w:t>
-      </w:r>
-      <w:bookmarkEnd w:id="20"/>
-      <w:bookmarkEnd w:id="21"/>
-    </w:p>
-    <w:p>
-      <w:pPr>
-        <w:pStyle w:val="FirstParagraph"/>
-        <w:spacing w:line="360" w:lineRule="auto"/>
-        <w:jc w:val="both"/>
-        <w:rPr>
-          <w:lang w:val="en-GB"/>
-        </w:rPr>
-      </w:pPr>
-      <w:r>
-        <w:rPr>
-          <w:lang w:val="en-GB"/>
-        </w:rPr>
-        <w:t>The first step was to determine the state of the old ValiPop program and identify how it operated. The existing documentation included with the old ValiPop seemed out-of-date, so I resulted to reading through the source code to gather an understanding of the execution flow. Reading Dr. Dalton’s thesis also provided insight into many features of the old ValiPop such as the options supported during execution. Once I had a rudimentary understanding of the program, I met with Dr. Dalton in-person to clarify additional details such as the statistics behind the population validation.</w:t>
-      </w:r>
-    </w:p>
-    <w:p>
-      <w:pPr>
-        <w:pStyle w:val="Heading3"/>
-        <w:spacing w:line="360" w:lineRule="auto"/>
-        <w:jc w:val="both"/>
-        <w:rPr>
-          <w:color w:val="auto"/>
-          <w:lang w:val="en-GB"/>
-        </w:rPr>
-      </w:pPr>
-      <w:bookmarkStart w:id="22" w:name="execute-the-program"/>
-      <w:bookmarkStart w:id="23" w:name="_Toc194328032"/>
-      <w:r>
-        <w:rPr>
-          <w:color w:val="auto"/>
-          <w:lang w:val="en-GB"/>
-        </w:rPr>
-        <w:t xml:space="preserve">4.2. Execute the </w:t>
-      </w:r>
-      <w:r>
-        <w:rPr>
-          <w:color w:val="auto"/>
-          <w:lang w:val="en-GB"/>
-        </w:rPr>
-        <w:t>P</w:t>
-      </w:r>
-      <w:r>
-        <w:rPr>
-          <w:color w:val="auto"/>
-          <w:lang w:val="en-GB"/>
-        </w:rPr>
-        <w:t>rogram</w:t>
-      </w:r>
-      <w:bookmarkEnd w:id="22"/>
-      <w:bookmarkEnd w:id="23"/>
-    </w:p>
-    <w:p>
-      <w:pPr>
-        <w:pStyle w:val="FirstParagraph"/>
-        <w:spacing w:line="360" w:lineRule="auto"/>
-        <w:jc w:val="both"/>
-        <w:rPr>
-          <w:lang w:val="en-GB"/>
-        </w:rPr>
-      </w:pPr>
-      <w:r>
-        <w:rPr>
-          <w:lang w:val="en-GB"/>
-        </w:rPr>
-        <w:t>Once I had a decent understanding of the old ValiPop, I attempted to execute the program. This included identifying and installing the necessary dependencies, modifying the source code to support execution on my machine, and fixing any errors that occurred during the process. With each attempt at running ValiPop, I needed to ensure the generated population was validated and written to records correctly.</w:t>
-      </w:r>
-    </w:p>
-    <w:p>
-      <w:pPr>
-        <w:pStyle w:val="Heading3"/>
-        <w:spacing w:line="360" w:lineRule="auto"/>
-        <w:jc w:val="both"/>
-        <w:rPr>
-          <w:lang w:val="en-GB"/>
-        </w:rPr>
-      </w:pPr>
-      <w:bookmarkStart w:id="24" w:name="simplify-execution"/>
-      <w:bookmarkStart w:id="25" w:name="_Toc194328033"/>
-      <w:r>
-        <w:rPr>
-          <w:color w:val="auto"/>
-          <w:lang w:val="en-GB"/>
-        </w:rPr>
-        <w:t xml:space="preserve">4.3. Simplify </w:t>
-      </w:r>
-      <w:r>
-        <w:rPr>
-          <w:color w:val="auto"/>
-          <w:lang w:val="en-GB"/>
-        </w:rPr>
-        <w:t>E</w:t>
-      </w:r>
-      <w:r>
-        <w:rPr>
-          <w:color w:val="auto"/>
-          <w:lang w:val="en-GB"/>
-        </w:rPr>
-        <w:t>xecution</w:t>
-      </w:r>
-      <w:bookmarkEnd w:id="24"/>
-      <w:bookmarkEnd w:id="25"/>
-    </w:p>
-    <w:p>
-      <w:pPr>
-        <w:pStyle w:val="FirstParagraph"/>
-        <w:spacing w:line="360" w:lineRule="auto"/>
-        <w:jc w:val="both"/>
-        <w:rPr>
-          <w:lang w:val="en-GB"/>
-        </w:rPr>
-      </w:pPr>
-      <w:r>
-        <w:rPr>
-          <w:lang w:val="en-GB"/>
-        </w:rPr>
-        <w:t xml:space="preserve">After successful running ValiPop on my machine, I proceeded to </w:t>
-      </w:r>
-      <w:r>
-        <w:rPr>
-          <w:lang w:val="en-GB"/>
-        </w:rPr>
-        <w:t>make</w:t>
-      </w:r>
-      <w:r>
-        <w:rPr>
-          <w:lang w:val="en-GB"/>
-        </w:rPr>
-        <w:t xml:space="preserve"> it more easily executable. I identified and removed unnecessary dependencies, as well as created a virtual environment to aid in installing the R dependencies. I additionally replaced hard-coded file paths with configurable paths, eventually being able to build and execute ValiPop on any Unix-like machine in a few steps.</w:t>
-      </w:r>
-    </w:p>
-    <w:p>
-      <w:pPr>
-        <w:pStyle w:val="BodyText"/>
-        <w:spacing w:line="360" w:lineRule="auto"/>
-        <w:jc w:val="both"/>
-        <w:rPr>
-          <w:lang w:val="en-GB"/>
-        </w:rPr>
-      </w:pPr>
-      <w:r>
-        <w:rPr>
-          <w:lang w:val="en-GB"/>
-        </w:rPr>
-        <w:t>To support running ValiPop on other operating systems like Windows, I later containerised the compilation and execution of ValiPop. Eventually, I was also able to integrate the external scripts used by ValiPop, allowing for it to run locally on Windows also.</w:t>
-      </w:r>
-    </w:p>
-    <w:p>
-      <w:pPr>
-        <w:pStyle w:val="Heading3"/>
-        <w:spacing w:line="360" w:lineRule="auto"/>
-        <w:jc w:val="both"/>
-        <w:rPr>
-          <w:color w:val="auto"/>
-          <w:lang w:val="en-GB"/>
-        </w:rPr>
-      </w:pPr>
-      <w:bookmarkStart w:id="26" w:name="simplify-development"/>
-      <w:bookmarkStart w:id="27" w:name="_Toc194328034"/>
-      <w:r>
-        <w:rPr>
-          <w:color w:val="auto"/>
-          <w:lang w:val="en-GB"/>
-        </w:rPr>
-        <w:t xml:space="preserve">4.4. Simplify </w:t>
-      </w:r>
-      <w:r>
-        <w:rPr>
-          <w:color w:val="auto"/>
-          <w:lang w:val="en-GB"/>
-        </w:rPr>
-        <w:t>D</w:t>
-      </w:r>
-      <w:r>
-        <w:rPr>
-          <w:color w:val="auto"/>
-          <w:lang w:val="en-GB"/>
-        </w:rPr>
-        <w:t>evelopment</w:t>
-      </w:r>
-      <w:bookmarkEnd w:id="26"/>
-      <w:bookmarkEnd w:id="27"/>
-    </w:p>
-    <w:p>
-      <w:pPr>
-        <w:pStyle w:val="FirstParagraph"/>
-        <w:spacing w:line="360" w:lineRule="auto"/>
-        <w:jc w:val="both"/>
-        <w:rPr>
-          <w:lang w:val="en-GB"/>
-        </w:rPr>
-      </w:pPr>
-      <w:r>
-        <w:rPr>
-          <w:lang w:val="en-GB"/>
-        </w:rPr>
-        <w:t xml:space="preserve">Once I could execute ValiPop more easily, I focused on restoring the testing. The tests were initially broken for the old </w:t>
-      </w:r>
-      <w:r>
-        <w:rPr>
-          <w:lang w:val="en-GB"/>
-        </w:rPr>
-        <w:t>ValiPop;</w:t>
-      </w:r>
-      <w:r>
-        <w:rPr>
-          <w:lang w:val="en-GB"/>
-        </w:rPr>
-        <w:t xml:space="preserve"> </w:t>
-      </w:r>
-      <w:r>
-        <w:rPr>
-          <w:lang w:val="en-GB"/>
-        </w:rPr>
-        <w:t>however,</w:t>
-      </w:r>
-      <w:r>
-        <w:rPr>
-          <w:lang w:val="en-GB"/>
-        </w:rPr>
-        <w:t xml:space="preserve"> I managed to recover them by fixing the problematic dependencies. Once restored, I implemented end-to-end tests which ensured ValiPop returned the same output given some input. This then allowed me to refactor and simplify sections of ValiPop whilst guaranteeing the same functionality.</w:t>
-      </w:r>
-    </w:p>
-    <w:p>
-      <w:pPr>
-        <w:pStyle w:val="Heading3"/>
-        <w:spacing w:line="360" w:lineRule="auto"/>
-        <w:jc w:val="both"/>
-        <w:rPr>
-          <w:color w:val="auto"/>
-          <w:lang w:val="en-GB"/>
-        </w:rPr>
-      </w:pPr>
-      <w:bookmarkStart w:id="28" w:name="integrate-features"/>
-      <w:bookmarkStart w:id="29" w:name="_Toc194328035"/>
-      <w:r>
-        <w:rPr>
-          <w:color w:val="auto"/>
-          <w:lang w:val="en-GB"/>
-        </w:rPr>
-        <w:t xml:space="preserve">4.5. Integrate </w:t>
-      </w:r>
-      <w:r>
-        <w:rPr>
-          <w:color w:val="auto"/>
-          <w:lang w:val="en-GB"/>
-        </w:rPr>
-        <w:t>F</w:t>
-      </w:r>
-      <w:r>
-        <w:rPr>
-          <w:color w:val="auto"/>
-          <w:lang w:val="en-GB"/>
-        </w:rPr>
-        <w:t>eatures</w:t>
-      </w:r>
-      <w:bookmarkEnd w:id="28"/>
-      <w:bookmarkEnd w:id="29"/>
-    </w:p>
-    <w:p>
-      <w:pPr>
-        <w:pStyle w:val="FirstParagraph"/>
-        <w:spacing w:line="360" w:lineRule="auto"/>
-        <w:jc w:val="both"/>
-        <w:rPr>
-          <w:lang w:val="en-GB"/>
-        </w:rPr>
-      </w:pPr>
-      <w:r>
-        <w:rPr>
-          <w:lang w:val="en-GB"/>
-        </w:rPr>
-        <w:t>With some additional testing established, I then worked on integrating additional features which improve the user experience of ValiPop. This included integrating the additional output formats, like GEDCOM which was already implemented, into the main program to be accessible by the user. I also added additional error handling when reading input to help users identify mistakes in their input configurations. Notably, whilst implementing error handling, I identified and fixed several bugs caused by unusual configuration options.</w:t>
-      </w:r>
-    </w:p>
-    <w:p>
-      <w:pPr>
-        <w:pStyle w:val="Heading3"/>
-        <w:spacing w:line="360" w:lineRule="auto"/>
-        <w:jc w:val="both"/>
-        <w:rPr>
-          <w:color w:val="auto"/>
-          <w:lang w:val="en-GB"/>
-        </w:rPr>
-      </w:pPr>
-      <w:bookmarkStart w:id="30" w:name="documentation"/>
-      <w:bookmarkStart w:id="31" w:name="_Toc194328036"/>
-      <w:r>
-        <w:rPr>
-          <w:color w:val="auto"/>
-          <w:lang w:val="en-GB"/>
-        </w:rPr>
-        <w:t>4.6. Documentation</w:t>
-      </w:r>
-      <w:bookmarkEnd w:id="30"/>
-      <w:bookmarkEnd w:id="31"/>
-    </w:p>
-    <w:p>
-      <w:pPr>
-        <w:pStyle w:val="FirstParagraph"/>
-        <w:spacing w:line="360" w:lineRule="auto"/>
-        <w:jc w:val="both"/>
-        <w:rPr>
-          <w:lang w:val="en-GB"/>
-        </w:rPr>
-      </w:pPr>
-      <w:r>
-        <w:rPr>
-          <w:lang w:val="en-GB"/>
-        </w:rPr>
-        <w:t xml:space="preserve">Throughout my software engineering approach, I wrote documentation about ValiPop. Whilst studying the code of the old ValiPop, I documented what I learned in the form of </w:t>
-      </w:r>
-      <w:r>
-        <w:rPr>
-          <w:lang w:val="en-GB"/>
-        </w:rPr>
-        <w:t>Javadoc</w:t>
-      </w:r>
-      <w:r>
-        <w:rPr>
-          <w:lang w:val="en-GB"/>
-        </w:rPr>
-        <w:t xml:space="preserve">. I also hosted additional documentation from the </w:t>
-      </w:r>
-      <w:r>
-        <w:rPr>
-          <w:lang w:val="en-GB"/>
-        </w:rPr>
-        <w:t>GitHub</w:t>
-      </w:r>
-      <w:r>
-        <w:rPr>
-          <w:lang w:val="en-GB"/>
-        </w:rPr>
-        <w:t xml:space="preserve"> repository, detailing the steps to compile and execute ValiPop both locally and with a container. To document the configuration options, input statistics, and results, I included reference sheets in the hosted documentation which explain each aspect briefly.</w:t>
-      </w:r>
-      <w:r>
-        <w:rPr>
-          <w:lang w:val="en-GB"/>
-        </w:rPr>
-        <w:t xml:space="preserve"> </w:t>
-      </w:r>
-      <w:r>
-        <w:rPr>
-          <w:lang w:val="en-GB"/>
-        </w:rPr>
-        <w:t>To support the future development of ValiPop, I also wrote documentation explaining how each section of ValiPop operates and how each input is used internally.</w:t>
-      </w:r>
-      <w:bookmarkStart w:id="32" w:name="ethics"/>
-    </w:p>
-    <w:p>
-      <w:pPr>
-        <w:pStyle w:val="Heading2"/>
-        <w:spacing w:line="360" w:lineRule="auto"/>
-        <w:jc w:val="both"/>
-        <w:rPr>
-          <w:color w:val="auto"/>
-          <w:lang w:val="en-GB"/>
-        </w:rPr>
-      </w:pPr>
-      <w:bookmarkStart w:id="33" w:name="_Toc194328037"/>
-      <w:r>
-        <w:rPr>
-          <w:color w:val="auto"/>
-          <w:lang w:val="en-GB"/>
-        </w:rPr>
-        <w:t>5. Ethics</w:t>
-      </w:r>
-      <w:bookmarkEnd w:id="32"/>
-      <w:bookmarkEnd w:id="33"/>
-    </w:p>
-    <w:p>
-      <w:pPr>
-        <w:pStyle w:val="FirstParagraph"/>
-        <w:spacing w:line="360" w:lineRule="auto"/>
-        <w:jc w:val="both"/>
-        <w:rPr>
-          <w:lang w:val="en-GB"/>
-        </w:rPr>
-      </w:pPr>
-      <w:r>
-        <w:rPr>
-          <w:lang w:val="en-GB"/>
-        </w:rPr>
-        <w:t>The genealogical populations generated by ValiPop are completely fabricated based on the input statistics provided, and do not reflect any real families or individuals. The input statistics provided by the ValiPop repository should also be publicly available to use and redistribute. Therefore, I believe this project did not raise any ethical issues and I completed a preliminary ethics self-assessment form to confirm this.</w:t>
-      </w:r>
-    </w:p>
-    <w:p>
-      <w:pPr>
-        <w:pStyle w:val="BodyText"/>
-        <w:spacing w:line="360" w:lineRule="auto"/>
-        <w:jc w:val="both"/>
-        <w:rPr>
-          <w:lang w:val="en-GB"/>
-        </w:rPr>
-      </w:pPr>
-      <w:r>
-        <w:rPr>
-          <w:lang w:val="en-GB"/>
-        </w:rPr>
-        <w:t>However, upon examining the input statistics included with the old ValiPop</w:t>
-      </w:r>
-      <w:r>
-        <w:rPr>
-          <w:lang w:val="en-GB"/>
-        </w:rPr>
-        <w:t xml:space="preserve"> repository</w:t>
-      </w:r>
-      <w:r>
-        <w:rPr>
-          <w:lang w:val="en-GB"/>
-        </w:rPr>
-        <w:t xml:space="preserve">, I identified six statistics which did not allow redistribution or public usage. Three distributions providing probabilities for historical British forenames and surnames </w:t>
-      </w:r>
-      <w:r>
-        <w:rPr>
-          <w:lang w:val="en-GB"/>
-        </w:rPr>
-        <w:t xml:space="preserve">and </w:t>
-      </w:r>
-      <w:r>
-        <w:rPr>
-          <w:lang w:val="en-GB"/>
-        </w:rPr>
-        <w:t>were retrieved from the North Atlantic Population Project (NAPP), which grants a limited license which prevent</w:t>
-      </w:r>
-      <w:r>
-        <w:rPr>
-          <w:lang w:val="en-GB"/>
-        </w:rPr>
-        <w:t>s</w:t>
-      </w:r>
-      <w:r>
-        <w:rPr>
-          <w:lang w:val="en-GB"/>
-        </w:rPr>
-        <w:t xml:space="preserve"> redistributing the data (Minnesota Population Center and University of Minnesota, 2025). The remaining three distributions provided probabilities for Dominican forenames and Spanish surnames and appeared to be from the parenting websites parenting.firstcry.com and familyeducation.com. However, both websites specify in their terms of use that the materials are copyrighted (Firstcry.com, 2025) (FEN, 2025).</w:t>
-      </w:r>
-    </w:p>
-    <w:p>
-      <w:pPr>
-        <w:pStyle w:val="BodyText"/>
-        <w:spacing w:line="360" w:lineRule="auto"/>
-        <w:jc w:val="both"/>
-        <w:rPr>
-          <w:lang w:val="en-GB"/>
-        </w:rPr>
-      </w:pPr>
-      <w:r>
-        <w:rPr>
-          <w:lang w:val="en-GB"/>
-        </w:rPr>
-        <w:t xml:space="preserve">To ensure the ValiPop repository only included open and redistributable data, I removed all instances of these statistics from the git commit history. The forename statistics were then replaced with open data retrieved from the Office for National Statistics (ONS), and the surnames statistics were replaced with data retrieved from the National Records of Scotland (NRS). Moreover, I included a file correctly citing and referencing the usage rights of each source among all the input statistics at </w:t>
-      </w:r>
-      <w:r>
-        <w:rPr>
-          <w:rStyle w:val="VerbatimChar"/>
-          <w:lang w:val="en-GB"/>
-        </w:rPr>
-        <w:t>src/main/resources/inputs/usage.md</w:t>
-      </w:r>
-      <w:r>
-        <w:rPr>
-          <w:lang w:val="en-GB"/>
-        </w:rPr>
-        <w:t>.</w:t>
-      </w:r>
-    </w:p>
-    <w:p>
-      <w:pPr>
-        <w:rPr>
-          <w:rFonts w:asciiTheme="majorHAnsi" w:eastAsiaTheme="majorEastAsia" w:hAnsiTheme="majorHAnsi" w:cstheme="majorBidi"/>
-          <w:b/>
-          <w:bCs/>
-          <w:sz w:val="32"/>
-          <w:szCs w:val="32"/>
-          <w:lang w:val="en-GB"/>
-        </w:rPr>
-      </w:pPr>
       <w:bookmarkStart w:id="34" w:name="design-and-implementation"/>
       <w:r>
         <w:rPr>
@@ -5466,7 +6430,21 @@
         <w:rPr>
           <w:lang w:val="en-GB"/>
         </w:rPr>
-        <w:t xml:space="preserve"> the code, I could verify that those changes would not change the end result for the user. Whilst there did already exist tests for the population simulation, these were typically unit tests testing specific interface implementations.</w:t>
+        <w:t xml:space="preserve"> the code, I could verify that those changes would not change </w:t>
+      </w:r>
+      <w:proofErr w:type="gramStart"/>
+      <w:r>
+        <w:rPr>
+          <w:lang w:val="en-GB"/>
+        </w:rPr>
+        <w:t>the end result</w:t>
+      </w:r>
+      <w:proofErr w:type="gramEnd"/>
+      <w:r>
+        <w:rPr>
+          <w:lang w:val="en-GB"/>
+        </w:rPr>
+        <w:t xml:space="preserve"> for the user. Whilst there did already exist tests for the population simulation, these were typically unit tests testing specific interface implementations.</w:t>
       </w:r>
     </w:p>
     <w:p>
@@ -5626,6 +6604,7 @@
         </w:rPr>
         <w:t xml:space="preserve">One such option was </w:t>
       </w:r>
+      <w:proofErr w:type="spellStart"/>
       <w:r>
         <w:rPr>
           <w:rStyle w:val="VerbatimChar"/>
@@ -5633,6 +6612,7 @@
         </w:rPr>
         <w:t>geography_source_location</w:t>
       </w:r>
+      <w:proofErr w:type="spellEnd"/>
       <w:r>
         <w:rPr>
           <w:lang w:val="en-GB"/>
@@ -5655,6 +6635,7 @@
         </w:rPr>
         <w:t xml:space="preserve">The other deprecated options where </w:t>
       </w:r>
+      <w:proofErr w:type="spellStart"/>
       <w:r>
         <w:rPr>
           <w:rStyle w:val="VerbatimChar"/>
@@ -5662,12 +6643,14 @@
         </w:rPr>
         <w:t>birth_factor</w:t>
       </w:r>
+      <w:proofErr w:type="spellEnd"/>
       <w:r>
         <w:rPr>
           <w:lang w:val="en-GB"/>
         </w:rPr>
         <w:t xml:space="preserve"> and </w:t>
       </w:r>
+      <w:proofErr w:type="spellStart"/>
       <w:r>
         <w:rPr>
           <w:rStyle w:val="VerbatimChar"/>
@@ -5675,12 +6658,28 @@
         </w:rPr>
         <w:t>death_factor</w:t>
       </w:r>
-      <w:r>
-        <w:rPr>
-          <w:lang w:val="en-GB"/>
-        </w:rPr>
-        <w:t xml:space="preserve">, which were more subtle due to them still influencing the program. Theses factors were used for correcting the simulation if it deviated from the statistics, by altering the number of births or deaths to occur. However, I noticed that </w:t>
-      </w:r>
+      <w:proofErr w:type="spellEnd"/>
+      <w:r>
+        <w:rPr>
+          <w:lang w:val="en-GB"/>
+        </w:rPr>
+        <w:t xml:space="preserve">, which were more subtle due to them still influencing the program. </w:t>
+      </w:r>
+      <w:proofErr w:type="spellStart"/>
+      <w:r>
+        <w:rPr>
+          <w:lang w:val="en-GB"/>
+        </w:rPr>
+        <w:t>Theses</w:t>
+      </w:r>
+      <w:proofErr w:type="spellEnd"/>
+      <w:r>
+        <w:rPr>
+          <w:lang w:val="en-GB"/>
+        </w:rPr>
+        <w:t xml:space="preserve"> factors were used for correcting the simulation if it deviated from the statistics, by altering the number of births or deaths to occur. However, I noticed that </w:t>
+      </w:r>
+      <w:proofErr w:type="spellStart"/>
       <w:r>
         <w:rPr>
           <w:rStyle w:val="VerbatimChar"/>
@@ -5688,12 +6687,14 @@
         </w:rPr>
         <w:t>recovery_factor</w:t>
       </w:r>
+      <w:proofErr w:type="spellEnd"/>
       <w:r>
         <w:rPr>
           <w:lang w:val="en-GB"/>
         </w:rPr>
         <w:t xml:space="preserve"> and </w:t>
       </w:r>
+      <w:proofErr w:type="spellStart"/>
       <w:r>
         <w:rPr>
           <w:rStyle w:val="VerbatimChar"/>
@@ -5701,6 +6702,7 @@
         </w:rPr>
         <w:t>proportional_recovery_factor</w:t>
       </w:r>
+      <w:proofErr w:type="spellEnd"/>
       <w:r>
         <w:rPr>
           <w:lang w:val="en-GB"/>
@@ -5913,6 +6915,7 @@
         </w:rPr>
         <w:t xml:space="preserve"> the </w:t>
       </w:r>
+      <w:proofErr w:type="spellStart"/>
       <w:r>
         <w:rPr>
           <w:rStyle w:val="VerbatimChar"/>
@@ -5920,6 +6923,7 @@
         </w:rPr>
         <w:t>renv</w:t>
       </w:r>
+      <w:proofErr w:type="spellEnd"/>
       <w:r>
         <w:rPr>
           <w:lang w:val="en-GB"/>
@@ -5958,6 +6962,7 @@
         </w:rPr>
         <w:t xml:space="preserve">However, initialising the R virtual environment first required users to install </w:t>
       </w:r>
+      <w:proofErr w:type="spellStart"/>
       <w:r>
         <w:rPr>
           <w:rStyle w:val="VerbatimChar"/>
@@ -5965,6 +6970,7 @@
         </w:rPr>
         <w:t>renv</w:t>
       </w:r>
+      <w:proofErr w:type="spellEnd"/>
       <w:r>
         <w:rPr>
           <w:lang w:val="en-GB"/>
@@ -6083,11 +7089,19 @@
           <w:lang w:val="en-GB"/>
         </w:rPr>
       </w:pPr>
-      <w:r>
-        <w:rPr>
-          <w:lang w:val="en-GB"/>
-        </w:rPr>
-        <w:t>Similar to the tests described in section</w:t>
+      <w:proofErr w:type="gramStart"/>
+      <w:r>
+        <w:rPr>
+          <w:lang w:val="en-GB"/>
+        </w:rPr>
+        <w:t>Similar to</w:t>
+      </w:r>
+      <w:proofErr w:type="gramEnd"/>
+      <w:r>
+        <w:rPr>
+          <w:lang w:val="en-GB"/>
+        </w:rPr>
+        <w:t xml:space="preserve"> the tests described in section</w:t>
       </w:r>
       <w:r>
         <w:rPr>
@@ -6099,7 +7113,21 @@
         <w:rPr>
           <w:lang w:val="en-GB"/>
         </w:rPr>
-        <w:t xml:space="preserve">, I pre-generated and saved a collection of population contingency tables from a variety of configurations. I also saved the validation score determined by passing them directly to the validation phase. I was then able to test changes to the validation phase by passing in the saved contingency tables and comparing the the resulting validation scores to the expected scores. A downside with this approach was the necessity of storing the collection of contingency tables in the repository, which also grow very large. </w:t>
+        <w:t xml:space="preserve">, I pre-generated and saved a collection of population contingency tables from a variety of configurations. I also saved the validation score determined by passing them directly to the validation phase. I was then able to test changes to the validation phase by passing in the saved contingency tables and comparing the </w:t>
+      </w:r>
+      <w:proofErr w:type="spellStart"/>
+      <w:r>
+        <w:rPr>
+          <w:lang w:val="en-GB"/>
+        </w:rPr>
+        <w:t>the</w:t>
+      </w:r>
+      <w:proofErr w:type="spellEnd"/>
+      <w:r>
+        <w:rPr>
+          <w:lang w:val="en-GB"/>
+        </w:rPr>
+        <w:t xml:space="preserve"> resulting validation scores to the expected scores. A downside with this approach was the necessity of storing the collection of contingency tables in the repository, which also grow very large. </w:t>
       </w:r>
       <w:r>
         <w:rPr>
@@ -6201,6 +7229,7 @@
         </w:rPr>
         <w:t xml:space="preserve"> required for the validation, particularly from seven packages down to a single package, </w:t>
       </w:r>
+      <w:proofErr w:type="spellStart"/>
       <w:r>
         <w:rPr>
           <w:rStyle w:val="VerbatimChar"/>
@@ -6208,6 +7237,7 @@
         </w:rPr>
         <w:t>geepack</w:t>
       </w:r>
+      <w:proofErr w:type="spellEnd"/>
       <w:r>
         <w:rPr>
           <w:lang w:val="en-GB"/>
@@ -6274,7 +7304,21 @@
         <w:rPr>
           <w:lang w:val="en-GB"/>
         </w:rPr>
-        <w:t xml:space="preserve"> I wanted to find a better approach to handling the external scripts used by ValiPop, and also ideally allow ValiPop to be decoupled from the operating system it is run on.</w:t>
+        <w:t xml:space="preserve"> I wanted to find a better approach to handling the external scripts used by ValiPop, </w:t>
+      </w:r>
+      <w:proofErr w:type="gramStart"/>
+      <w:r>
+        <w:rPr>
+          <w:lang w:val="en-GB"/>
+        </w:rPr>
+        <w:t>and also</w:t>
+      </w:r>
+      <w:proofErr w:type="gramEnd"/>
+      <w:r>
+        <w:rPr>
+          <w:lang w:val="en-GB"/>
+        </w:rPr>
+        <w:t xml:space="preserve"> ideally allow ValiPop to be decoupled from the operating system it is run on.</w:t>
       </w:r>
     </w:p>
     <w:p>
@@ -6306,7 +7350,21 @@
         <w:rPr>
           <w:lang w:val="en-GB"/>
         </w:rPr>
-        <w:t xml:space="preserve">However, I was unable to take the same approach with the R analysis as I found it to complex to implement in Java. Moreover, I was unable to find any equivalent package in Java that could perform the GEEGLM </w:t>
+        <w:t xml:space="preserve">However, I was unable to take the same approach with the R analysis as I found it </w:t>
+      </w:r>
+      <w:proofErr w:type="spellStart"/>
+      <w:r>
+        <w:rPr>
+          <w:lang w:val="en-GB"/>
+        </w:rPr>
+        <w:t>to</w:t>
+      </w:r>
+      <w:proofErr w:type="spellEnd"/>
+      <w:r>
+        <w:rPr>
+          <w:lang w:val="en-GB"/>
+        </w:rPr>
+        <w:t xml:space="preserve"> complex to implement in Java. Moreover, I was unable to find any equivalent package in Java that could perform the GEEGLM </w:t>
       </w:r>
       <w:r>
         <w:rPr>
@@ -6336,6 +7394,7 @@
         </w:rPr>
         <w:t xml:space="preserve">Alternatively, I considered using the </w:t>
       </w:r>
+      <w:proofErr w:type="spellStart"/>
       <w:r>
         <w:rPr>
           <w:rStyle w:val="VerbatimChar"/>
@@ -6343,6 +7402,7 @@
         </w:rPr>
         <w:t>Renjin</w:t>
       </w:r>
+      <w:proofErr w:type="spellEnd"/>
       <w:r>
         <w:rPr>
           <w:lang w:val="en-GB"/>
@@ -6361,6 +7421,7 @@
         </w:rPr>
         <w:t xml:space="preserve"> I found it difficult to incorporate the GEEGLM R package together with </w:t>
       </w:r>
+      <w:proofErr w:type="spellStart"/>
       <w:r>
         <w:rPr>
           <w:rStyle w:val="VerbatimChar"/>
@@ -6368,6 +7429,7 @@
         </w:rPr>
         <w:t>Renjin</w:t>
       </w:r>
+      <w:proofErr w:type="spellEnd"/>
       <w:r>
         <w:rPr>
           <w:lang w:val="en-GB"/>
@@ -6430,6 +7492,7 @@
         </w:rPr>
         <w:t xml:space="preserve">Therefore, this ultimately allowed for the validation phase of ValiPop to be run without any external scripts. This meant ValiPop by this point only required Java, the JAR file, R, and the </w:t>
       </w:r>
+      <w:proofErr w:type="spellStart"/>
       <w:r>
         <w:rPr>
           <w:rStyle w:val="VerbatimChar"/>
@@ -6437,6 +7500,7 @@
         </w:rPr>
         <w:t>geepack</w:t>
       </w:r>
+      <w:proofErr w:type="spellEnd"/>
       <w:r>
         <w:rPr>
           <w:lang w:val="en-GB"/>
@@ -6754,6 +7818,7 @@
         </w:rPr>
         <w:t xml:space="preserve">To integrate them, I added a new configuration option </w:t>
       </w:r>
+      <w:proofErr w:type="spellStart"/>
       <w:r>
         <w:rPr>
           <w:rStyle w:val="VerbatimChar"/>
@@ -6761,6 +7826,7 @@
         </w:rPr>
         <w:t>output_graph_format</w:t>
       </w:r>
+      <w:proofErr w:type="spellEnd"/>
       <w:r>
         <w:rPr>
           <w:lang w:val="en-GB"/>
@@ -6818,7 +7884,7 @@
                     <pic:cNvPicPr/>
                   </pic:nvPicPr>
                   <pic:blipFill>
-                    <a:blip r:embed="rId9">
+                    <a:blip r:embed="rId10">
                       <a:extLst>
                         <a:ext uri="{28A0092B-C50C-407E-A947-70E740481C1C}">
                           <a14:useLocalDpi xmlns:a14="http://schemas.microsoft.com/office/drawing/2010/main" val="0"/>
@@ -6905,6 +7971,7 @@
         </w:rPr>
         <w:t xml:space="preserve"> </w:t>
       </w:r>
+      <w:proofErr w:type="spellStart"/>
       <w:r>
         <w:rPr>
           <w:rFonts w:ascii="Consolas" w:hAnsi="Consolas"/>
@@ -6912,7 +7979,57 @@
           <w:szCs w:val="20"/>
           <w:lang w:val="en-GB"/>
         </w:rPr>
-        <w:t>src\test\resources\valipop\geojson\file5000_intended.geojson</w:t>
+        <w:t>src</w:t>
+      </w:r>
+      <w:proofErr w:type="spellEnd"/>
+      <w:r>
+        <w:rPr>
+          <w:rFonts w:ascii="Consolas" w:hAnsi="Consolas"/>
+          <w:sz w:val="20"/>
+          <w:szCs w:val="20"/>
+          <w:lang w:val="en-GB"/>
+        </w:rPr>
+        <w:t>\test\resources\</w:t>
+      </w:r>
+      <w:proofErr w:type="spellStart"/>
+      <w:r>
+        <w:rPr>
+          <w:rFonts w:ascii="Consolas" w:hAnsi="Consolas"/>
+          <w:sz w:val="20"/>
+          <w:szCs w:val="20"/>
+          <w:lang w:val="en-GB"/>
+        </w:rPr>
+        <w:t>valipop</w:t>
+      </w:r>
+      <w:proofErr w:type="spellEnd"/>
+      <w:r>
+        <w:rPr>
+          <w:rFonts w:ascii="Consolas" w:hAnsi="Consolas"/>
+          <w:sz w:val="20"/>
+          <w:szCs w:val="20"/>
+          <w:lang w:val="en-GB"/>
+        </w:rPr>
+        <w:t>\</w:t>
+      </w:r>
+      <w:proofErr w:type="spellStart"/>
+      <w:r>
+        <w:rPr>
+          <w:rFonts w:ascii="Consolas" w:hAnsi="Consolas"/>
+          <w:sz w:val="20"/>
+          <w:szCs w:val="20"/>
+          <w:lang w:val="en-GB"/>
+        </w:rPr>
+        <w:t>geojson</w:t>
+      </w:r>
+      <w:proofErr w:type="spellEnd"/>
+      <w:r>
+        <w:rPr>
+          <w:rFonts w:ascii="Consolas" w:hAnsi="Consolas"/>
+          <w:sz w:val="20"/>
+          <w:szCs w:val="20"/>
+          <w:lang w:val="en-GB"/>
+        </w:rPr>
+        <w:t>\file5000_intended.geojson</w:t>
       </w:r>
       <w:r>
         <w:rPr>
@@ -6933,7 +8050,7 @@
         </w:rPr>
         <w:t xml:space="preserve">file in the ValiPop repository, using </w:t>
       </w:r>
-      <w:hyperlink r:id="rId10" w:history="1">
+      <w:hyperlink r:id="rId11" w:history="1">
         <w:r>
           <w:rPr>
             <w:rStyle w:val="Hyperlink"/>
@@ -6978,7 +8095,21 @@
         <w:rPr>
           <w:lang w:val="en-GB"/>
         </w:rPr>
-        <w:t>Among the graph formats, only the GEDCOM format had proper testing in the old ValiPop, defining tests similar to those in section</w:t>
+        <w:t xml:space="preserve">Among the graph formats, only the GEDCOM format had proper testing in the old ValiPop, defining tests </w:t>
+      </w:r>
+      <w:proofErr w:type="gramStart"/>
+      <w:r>
+        <w:rPr>
+          <w:lang w:val="en-GB"/>
+        </w:rPr>
+        <w:t>similar to</w:t>
+      </w:r>
+      <w:proofErr w:type="gramEnd"/>
+      <w:r>
+        <w:rPr>
+          <w:lang w:val="en-GB"/>
+        </w:rPr>
+        <w:t xml:space="preserve"> those in section</w:t>
       </w:r>
       <w:r>
         <w:rPr>
@@ -7108,7 +8239,21 @@
         <w:rPr>
           <w:lang w:val="en-GB"/>
         </w:rPr>
-        <w:t xml:space="preserve">I additionally added logic to prevent impossible configurations, such as the start date being grater than the end date. This also ensured that the dates forming the initialisation period of the simulation were adequately far apart. In the population simulation, there is a period before records are written where people may be spawned in spontaneously to create a variety of starting families. I found that a variety of bugs occurred if the initialisation period was too </w:t>
+        <w:t xml:space="preserve">I additionally added logic to prevent impossible configurations, such as the start date being </w:t>
+      </w:r>
+      <w:proofErr w:type="spellStart"/>
+      <w:r>
+        <w:rPr>
+          <w:lang w:val="en-GB"/>
+        </w:rPr>
+        <w:t>grater</w:t>
+      </w:r>
+      <w:proofErr w:type="spellEnd"/>
+      <w:r>
+        <w:rPr>
+          <w:lang w:val="en-GB"/>
+        </w:rPr>
+        <w:t xml:space="preserve"> than the end date. This also ensured that the dates forming the initialisation period of the simulation were adequately far apart. In the population simulation, there is a period before records are written where people may be spawned in spontaneously to create a variety of starting families. I found that a variety of bugs occurred if the initialisation period was too </w:t>
       </w:r>
       <w:r>
         <w:rPr>
@@ -7196,7 +8341,21 @@
         <w:rPr>
           <w:lang w:val="en-GB"/>
         </w:rPr>
-        <w:t>, I opted to containerise ValiPop as an alternate way for it to run independently from the operating system. Containerisation is the act of packaging software with the necessary operating system libraries and dependencies to a create single lightweight executable which runs consistently on any infrastructure (Susnjara and Smalley, 2024). These packages are called containers, and are defined using images, which provide the necessary instructions to construct a container (Powell and Smalley, 2024).</w:t>
+        <w:t>, I opted to containerise ValiPop as an alternate way for it to run independently from the operating system. Containerisation is the act of packaging software with the necessary operating system libraries and dependencies to a create single lightweight executable which runs consistently on any infrastructure (</w:t>
+      </w:r>
+      <w:proofErr w:type="spellStart"/>
+      <w:r>
+        <w:rPr>
+          <w:lang w:val="en-GB"/>
+        </w:rPr>
+        <w:t>Susnjara</w:t>
+      </w:r>
+      <w:proofErr w:type="spellEnd"/>
+      <w:r>
+        <w:rPr>
+          <w:lang w:val="en-GB"/>
+        </w:rPr>
+        <w:t xml:space="preserve"> and Smalley, 2024). These packages are called containers, and are defined using images, which provide the necessary instructions to construct a container (Powell and Smalley, 2024).</w:t>
       </w:r>
     </w:p>
     <w:p>
@@ -7254,6 +8413,7 @@
         </w:rPr>
         <w:t xml:space="preserve"> so opted to use </w:t>
       </w:r>
+      <w:proofErr w:type="spellStart"/>
       <w:r>
         <w:rPr>
           <w:rStyle w:val="VerbatimChar"/>
@@ -7261,6 +8421,7 @@
         </w:rPr>
         <w:t>wget</w:t>
       </w:r>
+      <w:proofErr w:type="spellEnd"/>
       <w:r>
         <w:rPr>
           <w:lang w:val="en-GB"/>
@@ -7371,6 +8532,7 @@
         </w:rPr>
         <w:t xml:space="preserve"> and the factor search program. The minima search program was implemented using a gradient descent algorithm to find the best factors, however this was created specifically to find optimal values for </w:t>
       </w:r>
+      <w:proofErr w:type="spellStart"/>
       <w:r>
         <w:rPr>
           <w:rStyle w:val="VerbatimChar"/>
@@ -7378,12 +8540,14 @@
         </w:rPr>
         <w:t>birth_factor</w:t>
       </w:r>
+      <w:proofErr w:type="spellEnd"/>
       <w:r>
         <w:rPr>
           <w:lang w:val="en-GB"/>
         </w:rPr>
         <w:t xml:space="preserve"> and </w:t>
       </w:r>
+      <w:proofErr w:type="spellStart"/>
       <w:r>
         <w:rPr>
           <w:rStyle w:val="VerbatimChar"/>
@@ -7391,6 +8555,7 @@
         </w:rPr>
         <w:t>death_factor</w:t>
       </w:r>
+      <w:proofErr w:type="spellEnd"/>
       <w:r>
         <w:rPr>
           <w:lang w:val="en-GB"/>
@@ -7421,6 +8586,7 @@
         </w:rPr>
         <w:t xml:space="preserve">he factor search program found effective values for </w:t>
       </w:r>
+      <w:proofErr w:type="spellStart"/>
       <w:r>
         <w:rPr>
           <w:rStyle w:val="VerbatimChar"/>
@@ -7428,12 +8594,14 @@
         </w:rPr>
         <w:t>recovery_factor</w:t>
       </w:r>
+      <w:proofErr w:type="spellEnd"/>
       <w:r>
         <w:rPr>
           <w:lang w:val="en-GB"/>
         </w:rPr>
         <w:t xml:space="preserve"> and </w:t>
       </w:r>
+      <w:proofErr w:type="spellStart"/>
       <w:r>
         <w:rPr>
           <w:rStyle w:val="VerbatimChar"/>
@@ -7441,6 +8609,7 @@
         </w:rPr>
         <w:t>proportional_recovery_factor</w:t>
       </w:r>
+      <w:proofErr w:type="spellEnd"/>
       <w:r>
         <w:rPr>
           <w:lang w:val="en-GB"/>
@@ -7567,7 +8736,7 @@
         </w:rPr>
         <w:t xml:space="preserve">I implemented this distributed factor search using </w:t>
       </w:r>
-      <w:hyperlink r:id="rId11">
+      <w:hyperlink r:id="rId12">
         <w:r>
           <w:rPr>
             <w:rStyle w:val="Hyperlink"/>
@@ -7580,7 +8749,21 @@
         <w:rPr>
           <w:lang w:val="en-GB"/>
         </w:rPr>
-        <w:t xml:space="preserve"> to manage the work over a cluster automatically. For each combination of factors, I would create a configuration and distribute the configurations among the cluster workers to execute in parallel. Notably, this required me to define serialisable versions of the data being passed to workers. This implementation also supports running the factor search locally one machine, leveraging the number cores available to run in parallel.</w:t>
+        <w:t xml:space="preserve"> to manage the work over a cluster automatically. For each combination of factors, I would create a configuration and distribute the configurations among the cluster workers to execute in parallel. Notably, this required me to define </w:t>
+      </w:r>
+      <w:proofErr w:type="spellStart"/>
+      <w:r>
+        <w:rPr>
+          <w:lang w:val="en-GB"/>
+        </w:rPr>
+        <w:t>serialisable</w:t>
+      </w:r>
+      <w:proofErr w:type="spellEnd"/>
+      <w:r>
+        <w:rPr>
+          <w:lang w:val="en-GB"/>
+        </w:rPr>
+        <w:t xml:space="preserve"> versions of the data being passed to workers. This implementation also supports running the factor search locally one machine, leveraging the number cores available to run in parallel.</w:t>
       </w:r>
     </w:p>
     <w:p>
@@ -7760,7 +8943,21 @@
         <w:rPr>
           <w:lang w:val="en-GB"/>
         </w:rPr>
-        <w:t xml:space="preserve">For example, I created a Workflow to build ValiPop and run its tests after every commit, which helped me verify that ValiPop remained functional. However, I found that the runners which executed theses tests remotely had quite limited memory, which forced me to scale down some of the tests which generated larger populations. However most tests remained unchanged, and the </w:t>
+        <w:t xml:space="preserve">For example, I created a Workflow to build ValiPop and run its tests after every commit, which helped me verify that ValiPop remained functional. However, I found that the runners which executed </w:t>
+      </w:r>
+      <w:proofErr w:type="spellStart"/>
+      <w:r>
+        <w:rPr>
+          <w:lang w:val="en-GB"/>
+        </w:rPr>
+        <w:t>theses</w:t>
+      </w:r>
+      <w:proofErr w:type="spellEnd"/>
+      <w:r>
+        <w:rPr>
+          <w:lang w:val="en-GB"/>
+        </w:rPr>
+        <w:t xml:space="preserve"> tests remotely had quite limited memory, which forced me to scale down some of the tests which generated larger populations. However most tests remained unchanged, and the </w:t>
       </w:r>
       <w:r>
         <w:rPr>
@@ -7888,7 +9085,7 @@
         </w:rPr>
         <w:t xml:space="preserve"> viewed at the following address: </w:t>
       </w:r>
-      <w:hyperlink r:id="rId12" w:history="1">
+      <w:hyperlink r:id="rId13" w:history="1">
         <w:r>
           <w:rPr>
             <w:rStyle w:val="Hyperlink"/>
@@ -8034,21 +9231,19 @@
           <w:szCs w:val="20"/>
           <w:lang w:val="en-GB"/>
         </w:rPr>
-        <w:t>&lt;results_path&gt;/&lt;run_purpose&gt;/&lt;datetime&gt;/</w:t>
-      </w:r>
-    </w:p>
-    <w:p>
-      <w:pPr>
-        <w:pStyle w:val="BodyText"/>
-        <w:spacing w:before="120" w:after="120" w:line="200" w:lineRule="exact"/>
-        <w:jc w:val="both"/>
+        <w:t>&lt;</w:t>
+      </w:r>
+      <w:proofErr w:type="spellStart"/>
+      <w:r>
         <w:rPr>
           <w:rFonts w:ascii="Consolas" w:hAnsi="Consolas"/>
           <w:sz w:val="20"/>
           <w:szCs w:val="20"/>
           <w:lang w:val="en-GB"/>
         </w:rPr>
-      </w:pPr>
+        <w:t>results_path</w:t>
+      </w:r>
+      <w:proofErr w:type="spellEnd"/>
       <w:r>
         <w:rPr>
           <w:rFonts w:ascii="Consolas" w:hAnsi="Consolas"/>
@@ -8056,8 +9251,61 @@
           <w:szCs w:val="20"/>
           <w:lang w:val="en-GB"/>
         </w:rPr>
-        <w:t>├───analysis.R</w:t>
-      </w:r>
+        <w:t>&gt;/&lt;</w:t>
+      </w:r>
+      <w:proofErr w:type="spellStart"/>
+      <w:r>
+        <w:rPr>
+          <w:rFonts w:ascii="Consolas" w:hAnsi="Consolas"/>
+          <w:sz w:val="20"/>
+          <w:szCs w:val="20"/>
+          <w:lang w:val="en-GB"/>
+        </w:rPr>
+        <w:t>run_purpose</w:t>
+      </w:r>
+      <w:proofErr w:type="spellEnd"/>
+      <w:r>
+        <w:rPr>
+          <w:rFonts w:ascii="Consolas" w:hAnsi="Consolas"/>
+          <w:sz w:val="20"/>
+          <w:szCs w:val="20"/>
+          <w:lang w:val="en-GB"/>
+        </w:rPr>
+        <w:t>&gt;/&lt;datetime&gt;/</w:t>
+      </w:r>
+    </w:p>
+    <w:p>
+      <w:pPr>
+        <w:pStyle w:val="BodyText"/>
+        <w:spacing w:before="120" w:after="120" w:line="200" w:lineRule="exact"/>
+        <w:jc w:val="both"/>
+        <w:rPr>
+          <w:rFonts w:ascii="Consolas" w:hAnsi="Consolas"/>
+          <w:sz w:val="20"/>
+          <w:szCs w:val="20"/>
+          <w:lang w:val="en-GB"/>
+        </w:rPr>
+      </w:pPr>
+      <w:r>
+        <w:rPr>
+          <w:rFonts w:ascii="Consolas" w:hAnsi="Consolas"/>
+          <w:sz w:val="20"/>
+          <w:szCs w:val="20"/>
+          <w:lang w:val="en-GB"/>
+        </w:rPr>
+        <w:t>├───</w:t>
+      </w:r>
+      <w:proofErr w:type="spellStart"/>
+      <w:r>
+        <w:rPr>
+          <w:rFonts w:ascii="Consolas" w:hAnsi="Consolas"/>
+          <w:sz w:val="20"/>
+          <w:szCs w:val="20"/>
+          <w:lang w:val="en-GB"/>
+        </w:rPr>
+        <w:t>analysis.R</w:t>
+      </w:r>
+      <w:proofErr w:type="spellEnd"/>
     </w:p>
     <w:p>
       <w:pPr>
@@ -8577,9 +9825,31 @@
           <w:szCs w:val="20"/>
           <w:lang w:val="en-GB"/>
         </w:rPr>
-        <w:t xml:space="preserve">Figure 2: The directory structure diagram show in the results documentation at </w:t>
-      </w:r>
-      <w:hyperlink r:id="rId13" w:history="1">
+        <w:t xml:space="preserve">Figure 2: The directory structure diagram </w:t>
+      </w:r>
+      <w:proofErr w:type="gramStart"/>
+      <w:r>
+        <w:rPr>
+          <w:i/>
+          <w:iCs/>
+          <w:sz w:val="20"/>
+          <w:szCs w:val="20"/>
+          <w:lang w:val="en-GB"/>
+        </w:rPr>
+        <w:t>show</w:t>
+      </w:r>
+      <w:proofErr w:type="gramEnd"/>
+      <w:r>
+        <w:rPr>
+          <w:i/>
+          <w:iCs/>
+          <w:sz w:val="20"/>
+          <w:szCs w:val="20"/>
+          <w:lang w:val="en-GB"/>
+        </w:rPr>
+        <w:t xml:space="preserve"> in the results documentation at </w:t>
+      </w:r>
+      <w:hyperlink r:id="rId14" w:history="1">
         <w:r>
           <w:rPr>
             <w:rStyle w:val="Hyperlink"/>
@@ -8804,7 +10074,21 @@
         <w:rPr>
           <w:lang w:val="en-GB"/>
         </w:rPr>
-        <w:t>This section evaluates the work I completed on ValiPop with regards to the original requirements specified. While completing all of the primary requirement and many of the secondary requirements, I also found that some of my work (such as the factor searching) was not captured under the requirements but still contributed to overarching goal of restoring and improving ValiPop.</w:t>
+        <w:t xml:space="preserve">This section evaluates the work I completed on ValiPop with regards to the original requirements specified. While completing </w:t>
+      </w:r>
+      <w:proofErr w:type="gramStart"/>
+      <w:r>
+        <w:rPr>
+          <w:lang w:val="en-GB"/>
+        </w:rPr>
+        <w:t>all of</w:t>
+      </w:r>
+      <w:proofErr w:type="gramEnd"/>
+      <w:r>
+        <w:rPr>
+          <w:lang w:val="en-GB"/>
+        </w:rPr>
+        <w:t xml:space="preserve"> the primary requirement and many of the secondary requirements, I also found that some of my work (such as the factor searching) was not captured under the requirements but still contributed to overarching goal of restoring and improving ValiPop.</w:t>
       </w:r>
     </w:p>
     <w:p>
@@ -9064,7 +10348,21 @@
         <w:rPr>
           <w:lang w:val="en-GB"/>
         </w:rPr>
-        <w:t>The fourth requirement focused on expanding the population simulation by adding additional features. I was not able to achieve this however due to a lack of time. I instead found there were too much work to be done with restoring the base ValiPop be fore I could start building upon it.</w:t>
+        <w:t xml:space="preserve">The fourth requirement focused on expanding the population simulation by adding additional features. I was not able to achieve this however due to a lack of time. I instead found there were too much work to be done with restoring the base ValiPop </w:t>
+      </w:r>
+      <w:proofErr w:type="spellStart"/>
+      <w:r>
+        <w:rPr>
+          <w:lang w:val="en-GB"/>
+        </w:rPr>
+        <w:t>be fore</w:t>
+      </w:r>
+      <w:proofErr w:type="spellEnd"/>
+      <w:r>
+        <w:rPr>
+          <w:lang w:val="en-GB"/>
+        </w:rPr>
+        <w:t xml:space="preserve"> I could start building upon it.</w:t>
       </w:r>
     </w:p>
     <w:p>
@@ -9198,7 +10496,21 @@
         <w:rPr>
           <w:lang w:val="en-GB"/>
         </w:rPr>
-        <w:t>One aspect I found particularly challenging was working with the validation, and consequently the statistical side of ValiPop. Since I lacked the necessary knowledge to understand how the analysis actually validated the population, I needed to do additional research on the concepts used to allow me to refactor the validation and ensure its correctness.</w:t>
+        <w:t xml:space="preserve">One aspect I found particularly challenging was working with the validation, and consequently the statistical side of ValiPop. Since I lacked the necessary knowledge to understand how the analysis </w:t>
+      </w:r>
+      <w:proofErr w:type="gramStart"/>
+      <w:r>
+        <w:rPr>
+          <w:lang w:val="en-GB"/>
+        </w:rPr>
+        <w:t>actually validated</w:t>
+      </w:r>
+      <w:proofErr w:type="gramEnd"/>
+      <w:r>
+        <w:rPr>
+          <w:lang w:val="en-GB"/>
+        </w:rPr>
+        <w:t xml:space="preserve"> the population, I needed to do additional research on the concepts used to allow me to refactor the validation and ensure its correctness.</w:t>
       </w:r>
     </w:p>
     <w:p>
@@ -9292,7 +10604,21 @@
         <w:rPr>
           <w:lang w:val="en-GB"/>
         </w:rPr>
-        <w:t>For example, whilst implementing continuous integration was a novel feature to help verify ValiPop commits, it did require me to ultimately reduce the number of tests to smaller population sizes. Had I more time, I should have look into supporting all sizes of tests and just specifying which tests in particular should be run during continuous integration. Moreover, whilst I did add many tests to ValiPop, I feel I could have implemented even more. For example, I felt I should have added additional test configurations to the end-to-end population simulation tests, as whilst they did cover a variety of configurations which were relevant to my work on ValiPop, they did not cover every configuration option and their impacts. I also could have added more unit tests targeting the record output formats, as these were quite error prone when I originally tried them in the old ValiPop.</w:t>
+        <w:t xml:space="preserve">For example, whilst implementing continuous integration was a novel feature to help verify ValiPop commits, it did require me to ultimately reduce the number of tests to smaller population sizes. Had I more time, I should have </w:t>
+      </w:r>
+      <w:proofErr w:type="gramStart"/>
+      <w:r>
+        <w:rPr>
+          <w:lang w:val="en-GB"/>
+        </w:rPr>
+        <w:t>look into</w:t>
+      </w:r>
+      <w:proofErr w:type="gramEnd"/>
+      <w:r>
+        <w:rPr>
+          <w:lang w:val="en-GB"/>
+        </w:rPr>
+        <w:t xml:space="preserve"> supporting all sizes of tests and just specifying which tests in particular should be run during continuous integration. Moreover, whilst I did add many tests to ValiPop, I feel I could have implemented even more. For example, I felt I should have added additional test configurations to the end-to-end population simulation tests, as whilst they did cover a variety of configurations which were relevant to my work on ValiPop, they did not cover every configuration option and their impacts. I also could have added more unit tests targeting the record output formats, as these were quite error prone when I originally tried them in the old ValiPop.</w:t>
       </w:r>
     </w:p>
     <w:p>
@@ -9422,11 +10748,33 @@
           <w:lang w:val="en-GB"/>
         </w:rPr>
       </w:pPr>
-      <w:r>
-        <w:rPr>
-          <w:lang w:val="en-GB"/>
-        </w:rPr>
-        <w:t>Were I to take on the restoration of ValiPop again, I would have taken a different approach. Firstly, I would have focused earlier on running the program and experimenting with its options as opposed to trying to fully understand the program beforehand through studying the code. I found that I when testing out the options of ValiPop and experimenting with its validation phase, I learned much quicker by example than I had from deciphering source code. In addition, whilst the time spent on learning the source code gave me a deeper understating of ValiPop, it was not always relevant for achieving my requirements. For example, having a deep understanding of the population simulation mechanisms helped in writing better documentation, but was not essential for the majority of my requirements, which focused on ValiPop as a whole.</w:t>
+      <w:proofErr w:type="spellStart"/>
+      <w:r>
+        <w:rPr>
+          <w:lang w:val="en-GB"/>
+        </w:rPr>
+        <w:t>Were</w:t>
+      </w:r>
+      <w:proofErr w:type="spellEnd"/>
+      <w:r>
+        <w:rPr>
+          <w:lang w:val="en-GB"/>
+        </w:rPr>
+        <w:t xml:space="preserve"> I to take on the restoration of ValiPop again, I would have taken a different approach. Firstly, I would have focused earlier on running the program and experimenting with its options as opposed to trying to fully understand the program beforehand through studying the code. I found that I when testing out the options of ValiPop and experimenting with its validation phase, I learned much quicker by example than I had from deciphering source code. In addition, whilst the time spent on learning the source code gave me a deeper understating of ValiPop, it was not always relevant for achieving my requirements. For example, having a deep understanding of the population simulation mechanisms helped in writing better documentation, but was not essential for </w:t>
+      </w:r>
+      <w:proofErr w:type="gramStart"/>
+      <w:r>
+        <w:rPr>
+          <w:lang w:val="en-GB"/>
+        </w:rPr>
+        <w:t>the majority of</w:t>
+      </w:r>
+      <w:proofErr w:type="gramEnd"/>
+      <w:r>
+        <w:rPr>
+          <w:lang w:val="en-GB"/>
+        </w:rPr>
+        <w:t xml:space="preserve"> my requirements, which focused on ValiPop as a whole.</w:t>
       </w:r>
     </w:p>
     <w:p>
@@ -9658,7 +11006,7 @@
         </w:rPr>
         <w:t xml:space="preserve">. Retrieved from </w:t>
       </w:r>
-      <w:hyperlink r:id="rId14" w:history="1">
+      <w:hyperlink r:id="rId15" w:history="1">
         <w:r>
           <w:rPr>
             <w:rStyle w:val="Hyperlink"/>
@@ -9695,7 +11043,7 @@
         </w:rPr>
         <w:t xml:space="preserve">. Retrieved from </w:t>
       </w:r>
-      <w:hyperlink r:id="rId15" w:history="1">
+      <w:hyperlink r:id="rId16" w:history="1">
         <w:r>
           <w:rPr>
             <w:rStyle w:val="Hyperlink"/>
@@ -9732,7 +11080,7 @@
         </w:rPr>
         <w:t xml:space="preserve">. Retrieved from </w:t>
       </w:r>
-      <w:hyperlink r:id="rId16" w:history="1">
+      <w:hyperlink r:id="rId17" w:history="1">
         <w:r>
           <w:rPr>
             <w:rStyle w:val="Hyperlink"/>
@@ -9769,7 +11117,7 @@
         </w:rPr>
         <w:t xml:space="preserve">. Retrieved from </w:t>
       </w:r>
-      <w:hyperlink r:id="rId17" w:history="1">
+      <w:hyperlink r:id="rId18" w:history="1">
         <w:r>
           <w:rPr>
             <w:rStyle w:val="Hyperlink"/>
@@ -9791,7 +11139,21 @@
         <w:rPr>
           <w:lang w:val="en-GB"/>
         </w:rPr>
-        <w:t xml:space="preserve">Minnesota Population Center and University of Minnesota (2025). Citation of NAPP. </w:t>
+        <w:t xml:space="preserve">Minnesota Population </w:t>
+      </w:r>
+      <w:proofErr w:type="spellStart"/>
+      <w:r>
+        <w:rPr>
+          <w:lang w:val="en-GB"/>
+        </w:rPr>
+        <w:t>Center</w:t>
+      </w:r>
+      <w:proofErr w:type="spellEnd"/>
+      <w:r>
+        <w:rPr>
+          <w:lang w:val="en-GB"/>
+        </w:rPr>
+        <w:t xml:space="preserve"> and University of Minnesota (2025). Citation of NAPP. </w:t>
       </w:r>
       <w:r>
         <w:rPr>
@@ -9806,7 +11168,7 @@
         </w:rPr>
         <w:t xml:space="preserve">. Retrieved from </w:t>
       </w:r>
-      <w:hyperlink r:id="rId18" w:history="1">
+      <w:hyperlink r:id="rId19" w:history="1">
         <w:r>
           <w:rPr>
             <w:rStyle w:val="Hyperlink"/>
@@ -9828,7 +11190,21 @@
         <w:rPr>
           <w:lang w:val="en-GB"/>
         </w:rPr>
-        <w:t xml:space="preserve">Powell, P. and Smallay, I. (2025 August 9). What is a container image? </w:t>
+        <w:t xml:space="preserve">Powell, P. and </w:t>
+      </w:r>
+      <w:proofErr w:type="spellStart"/>
+      <w:r>
+        <w:rPr>
+          <w:lang w:val="en-GB"/>
+        </w:rPr>
+        <w:t>Smallay</w:t>
+      </w:r>
+      <w:proofErr w:type="spellEnd"/>
+      <w:r>
+        <w:rPr>
+          <w:lang w:val="en-GB"/>
+        </w:rPr>
+        <w:t xml:space="preserve">, I. (2025 August 9). What is a container image? </w:t>
       </w:r>
       <w:r>
         <w:rPr>
@@ -9843,7 +11219,7 @@
         </w:rPr>
         <w:t xml:space="preserve">. Retrieved from </w:t>
       </w:r>
-      <w:hyperlink r:id="rId19" w:history="1">
+      <w:hyperlink r:id="rId20" w:history="1">
         <w:r>
           <w:rPr>
             <w:rStyle w:val="Hyperlink"/>
@@ -9880,7 +11256,7 @@
         </w:rPr>
         <w:t xml:space="preserve">. Retrieved from </w:t>
       </w:r>
-      <w:hyperlink r:id="rId20" w:history="1">
+      <w:hyperlink r:id="rId21" w:history="1">
         <w:r>
           <w:rPr>
             <w:rStyle w:val="Hyperlink"/>
@@ -9902,7 +11278,35 @@
         <w:rPr>
           <w:lang w:val="en-GB"/>
         </w:rPr>
-        <w:t xml:space="preserve">The Graphviz Authors (2025). Graphviz. </w:t>
+        <w:t xml:space="preserve">The </w:t>
+      </w:r>
+      <w:proofErr w:type="spellStart"/>
+      <w:r>
+        <w:rPr>
+          <w:lang w:val="en-GB"/>
+        </w:rPr>
+        <w:t>Graphviz</w:t>
+      </w:r>
+      <w:proofErr w:type="spellEnd"/>
+      <w:r>
+        <w:rPr>
+          <w:lang w:val="en-GB"/>
+        </w:rPr>
+        <w:t xml:space="preserve"> Authors (2025). </w:t>
+      </w:r>
+      <w:proofErr w:type="spellStart"/>
+      <w:r>
+        <w:rPr>
+          <w:lang w:val="en-GB"/>
+        </w:rPr>
+        <w:t>Graphviz</w:t>
+      </w:r>
+      <w:proofErr w:type="spellEnd"/>
+      <w:r>
+        <w:rPr>
+          <w:lang w:val="en-GB"/>
+        </w:rPr>
+        <w:t xml:space="preserve">. </w:t>
       </w:r>
       <w:r>
         <w:rPr>
@@ -9917,7 +11321,7 @@
         </w:rPr>
         <w:t xml:space="preserve">. Retrieved from </w:t>
       </w:r>
-      <w:hyperlink r:id="rId21" w:history="1">
+      <w:hyperlink r:id="rId22" w:history="1">
         <w:r>
           <w:rPr>
             <w:rStyle w:val="Hyperlink"/>
@@ -9935,11 +11339,33 @@
           <w:lang w:val="en-GB"/>
         </w:rPr>
       </w:pPr>
-      <w:r>
-        <w:rPr>
-          <w:lang w:val="en-GB"/>
-        </w:rPr>
-        <w:t xml:space="preserve">Smallay, I. and Susnjara, S. (2024, May 20). What is containerization. </w:t>
+      <w:proofErr w:type="spellStart"/>
+      <w:r>
+        <w:rPr>
+          <w:lang w:val="en-GB"/>
+        </w:rPr>
+        <w:t>Smallay</w:t>
+      </w:r>
+      <w:proofErr w:type="spellEnd"/>
+      <w:r>
+        <w:rPr>
+          <w:lang w:val="en-GB"/>
+        </w:rPr>
+        <w:t xml:space="preserve">, I. and </w:t>
+      </w:r>
+      <w:proofErr w:type="spellStart"/>
+      <w:r>
+        <w:rPr>
+          <w:lang w:val="en-GB"/>
+        </w:rPr>
+        <w:t>Susnjara</w:t>
+      </w:r>
+      <w:proofErr w:type="spellEnd"/>
+      <w:r>
+        <w:rPr>
+          <w:lang w:val="en-GB"/>
+        </w:rPr>
+        <w:t xml:space="preserve">, S. (2024, May 20). What is containerization. </w:t>
       </w:r>
       <w:r>
         <w:rPr>
@@ -9954,7 +11380,7 @@
         </w:rPr>
         <w:t xml:space="preserve">. Retrieved from </w:t>
       </w:r>
-      <w:hyperlink r:id="rId22" w:history="1">
+      <w:hyperlink r:id="rId23" w:history="1">
         <w:r>
           <w:rPr>
             <w:rStyle w:val="Hyperlink"/>
@@ -10103,7 +11529,7 @@
       <w:bookmarkEnd w:id="81"/>
     </w:p>
     <w:sectPr>
-      <w:footerReference w:type="first" r:id="rId23"/>
+      <w:footerReference w:type="first" r:id="rId24"/>
       <w:pgSz w:w="12240" w:h="15840"/>
       <w:pgMar w:top="1440" w:right="1440" w:bottom="1440" w:left="1440" w:header="708" w:footer="708" w:gutter="0"/>
       <w:pgNumType w:start="1"/>
@@ -10496,6 +11922,119 @@
     </w:lvl>
   </w:abstractNum>
   <w:abstractNum w:abstractNumId="3" w15:restartNumberingAfterBreak="0">
+    <w:nsid w:val="3C705141"/>
+    <w:multiLevelType w:val="hybridMultilevel"/>
+    <w:tmpl w:val="647EB3A6"/>
+    <w:lvl w:ilvl="0" w:tplc="66F2D044">
+      <w:start w:val="2"/>
+      <w:numFmt w:val="bullet"/>
+      <w:lvlText w:val="-"/>
+      <w:lvlJc w:val="left"/>
+      <w:pPr>
+        <w:ind w:left="720" w:hanging="360"/>
+      </w:pPr>
+      <w:rPr>
+        <w:rFonts w:ascii="Cambria" w:eastAsiaTheme="minorHAnsi" w:hAnsi="Cambria" w:cstheme="minorBidi" w:hint="default"/>
+      </w:rPr>
+    </w:lvl>
+    <w:lvl w:ilvl="1" w:tplc="04140003" w:tentative="1">
+      <w:start w:val="1"/>
+      <w:numFmt w:val="bullet"/>
+      <w:lvlText w:val="o"/>
+      <w:lvlJc w:val="left"/>
+      <w:pPr>
+        <w:ind w:left="1440" w:hanging="360"/>
+      </w:pPr>
+      <w:rPr>
+        <w:rFonts w:ascii="Courier New" w:hAnsi="Courier New" w:cs="Courier New" w:hint="default"/>
+      </w:rPr>
+    </w:lvl>
+    <w:lvl w:ilvl="2" w:tplc="04140005" w:tentative="1">
+      <w:start w:val="1"/>
+      <w:numFmt w:val="bullet"/>
+      <w:lvlText w:val=""/>
+      <w:lvlJc w:val="left"/>
+      <w:pPr>
+        <w:ind w:left="2160" w:hanging="360"/>
+      </w:pPr>
+      <w:rPr>
+        <w:rFonts w:ascii="Wingdings" w:hAnsi="Wingdings" w:hint="default"/>
+      </w:rPr>
+    </w:lvl>
+    <w:lvl w:ilvl="3" w:tplc="04140001" w:tentative="1">
+      <w:start w:val="1"/>
+      <w:numFmt w:val="bullet"/>
+      <w:lvlText w:val=""/>
+      <w:lvlJc w:val="left"/>
+      <w:pPr>
+        <w:ind w:left="2880" w:hanging="360"/>
+      </w:pPr>
+      <w:rPr>
+        <w:rFonts w:ascii="Symbol" w:hAnsi="Symbol" w:hint="default"/>
+      </w:rPr>
+    </w:lvl>
+    <w:lvl w:ilvl="4" w:tplc="04140003" w:tentative="1">
+      <w:start w:val="1"/>
+      <w:numFmt w:val="bullet"/>
+      <w:lvlText w:val="o"/>
+      <w:lvlJc w:val="left"/>
+      <w:pPr>
+        <w:ind w:left="3600" w:hanging="360"/>
+      </w:pPr>
+      <w:rPr>
+        <w:rFonts w:ascii="Courier New" w:hAnsi="Courier New" w:cs="Courier New" w:hint="default"/>
+      </w:rPr>
+    </w:lvl>
+    <w:lvl w:ilvl="5" w:tplc="04140005" w:tentative="1">
+      <w:start w:val="1"/>
+      <w:numFmt w:val="bullet"/>
+      <w:lvlText w:val=""/>
+      <w:lvlJc w:val="left"/>
+      <w:pPr>
+        <w:ind w:left="4320" w:hanging="360"/>
+      </w:pPr>
+      <w:rPr>
+        <w:rFonts w:ascii="Wingdings" w:hAnsi="Wingdings" w:hint="default"/>
+      </w:rPr>
+    </w:lvl>
+    <w:lvl w:ilvl="6" w:tplc="04140001" w:tentative="1">
+      <w:start w:val="1"/>
+      <w:numFmt w:val="bullet"/>
+      <w:lvlText w:val=""/>
+      <w:lvlJc w:val="left"/>
+      <w:pPr>
+        <w:ind w:left="5040" w:hanging="360"/>
+      </w:pPr>
+      <w:rPr>
+        <w:rFonts w:ascii="Symbol" w:hAnsi="Symbol" w:hint="default"/>
+      </w:rPr>
+    </w:lvl>
+    <w:lvl w:ilvl="7" w:tplc="04140003" w:tentative="1">
+      <w:start w:val="1"/>
+      <w:numFmt w:val="bullet"/>
+      <w:lvlText w:val="o"/>
+      <w:lvlJc w:val="left"/>
+      <w:pPr>
+        <w:ind w:left="5760" w:hanging="360"/>
+      </w:pPr>
+      <w:rPr>
+        <w:rFonts w:ascii="Courier New" w:hAnsi="Courier New" w:cs="Courier New" w:hint="default"/>
+      </w:rPr>
+    </w:lvl>
+    <w:lvl w:ilvl="8" w:tplc="04140005" w:tentative="1">
+      <w:start w:val="1"/>
+      <w:numFmt w:val="bullet"/>
+      <w:lvlText w:val=""/>
+      <w:lvlJc w:val="left"/>
+      <w:pPr>
+        <w:ind w:left="6480" w:hanging="360"/>
+      </w:pPr>
+      <w:rPr>
+        <w:rFonts w:ascii="Wingdings" w:hAnsi="Wingdings" w:hint="default"/>
+      </w:rPr>
+    </w:lvl>
+  </w:abstractNum>
+  <w:abstractNum w:abstractNumId="4" w15:restartNumberingAfterBreak="0">
     <w:nsid w:val="71315DCA"/>
     <w:multiLevelType w:val="multilevel"/>
     <w:tmpl w:val="FEC09330"/>
@@ -10597,6 +12136,119 @@
         </w:tabs>
         <w:ind w:left="6240" w:hanging="480"/>
       </w:pPr>
+    </w:lvl>
+  </w:abstractNum>
+  <w:abstractNum w:abstractNumId="5" w15:restartNumberingAfterBreak="0">
+    <w:nsid w:val="7576711A"/>
+    <w:multiLevelType w:val="hybridMultilevel"/>
+    <w:tmpl w:val="3E2C7D08"/>
+    <w:lvl w:ilvl="0" w:tplc="434648DA">
+      <w:start w:val="2"/>
+      <w:numFmt w:val="bullet"/>
+      <w:lvlText w:val=""/>
+      <w:lvlJc w:val="left"/>
+      <w:pPr>
+        <w:ind w:left="720" w:hanging="360"/>
+      </w:pPr>
+      <w:rPr>
+        <w:rFonts w:ascii="Cambria" w:eastAsiaTheme="minorHAnsi" w:hAnsi="Cambria" w:cstheme="minorBidi" w:hint="default"/>
+      </w:rPr>
+    </w:lvl>
+    <w:lvl w:ilvl="1" w:tplc="04140003" w:tentative="1">
+      <w:start w:val="1"/>
+      <w:numFmt w:val="bullet"/>
+      <w:lvlText w:val="o"/>
+      <w:lvlJc w:val="left"/>
+      <w:pPr>
+        <w:ind w:left="1440" w:hanging="360"/>
+      </w:pPr>
+      <w:rPr>
+        <w:rFonts w:ascii="Courier New" w:hAnsi="Courier New" w:cs="Courier New" w:hint="default"/>
+      </w:rPr>
+    </w:lvl>
+    <w:lvl w:ilvl="2" w:tplc="04140005" w:tentative="1">
+      <w:start w:val="1"/>
+      <w:numFmt w:val="bullet"/>
+      <w:lvlText w:val=""/>
+      <w:lvlJc w:val="left"/>
+      <w:pPr>
+        <w:ind w:left="2160" w:hanging="360"/>
+      </w:pPr>
+      <w:rPr>
+        <w:rFonts w:ascii="Wingdings" w:hAnsi="Wingdings" w:hint="default"/>
+      </w:rPr>
+    </w:lvl>
+    <w:lvl w:ilvl="3" w:tplc="04140001" w:tentative="1">
+      <w:start w:val="1"/>
+      <w:numFmt w:val="bullet"/>
+      <w:lvlText w:val=""/>
+      <w:lvlJc w:val="left"/>
+      <w:pPr>
+        <w:ind w:left="2880" w:hanging="360"/>
+      </w:pPr>
+      <w:rPr>
+        <w:rFonts w:ascii="Symbol" w:hAnsi="Symbol" w:hint="default"/>
+      </w:rPr>
+    </w:lvl>
+    <w:lvl w:ilvl="4" w:tplc="04140003" w:tentative="1">
+      <w:start w:val="1"/>
+      <w:numFmt w:val="bullet"/>
+      <w:lvlText w:val="o"/>
+      <w:lvlJc w:val="left"/>
+      <w:pPr>
+        <w:ind w:left="3600" w:hanging="360"/>
+      </w:pPr>
+      <w:rPr>
+        <w:rFonts w:ascii="Courier New" w:hAnsi="Courier New" w:cs="Courier New" w:hint="default"/>
+      </w:rPr>
+    </w:lvl>
+    <w:lvl w:ilvl="5" w:tplc="04140005" w:tentative="1">
+      <w:start w:val="1"/>
+      <w:numFmt w:val="bullet"/>
+      <w:lvlText w:val=""/>
+      <w:lvlJc w:val="left"/>
+      <w:pPr>
+        <w:ind w:left="4320" w:hanging="360"/>
+      </w:pPr>
+      <w:rPr>
+        <w:rFonts w:ascii="Wingdings" w:hAnsi="Wingdings" w:hint="default"/>
+      </w:rPr>
+    </w:lvl>
+    <w:lvl w:ilvl="6" w:tplc="04140001" w:tentative="1">
+      <w:start w:val="1"/>
+      <w:numFmt w:val="bullet"/>
+      <w:lvlText w:val=""/>
+      <w:lvlJc w:val="left"/>
+      <w:pPr>
+        <w:ind w:left="5040" w:hanging="360"/>
+      </w:pPr>
+      <w:rPr>
+        <w:rFonts w:ascii="Symbol" w:hAnsi="Symbol" w:hint="default"/>
+      </w:rPr>
+    </w:lvl>
+    <w:lvl w:ilvl="7" w:tplc="04140003" w:tentative="1">
+      <w:start w:val="1"/>
+      <w:numFmt w:val="bullet"/>
+      <w:lvlText w:val="o"/>
+      <w:lvlJc w:val="left"/>
+      <w:pPr>
+        <w:ind w:left="5760" w:hanging="360"/>
+      </w:pPr>
+      <w:rPr>
+        <w:rFonts w:ascii="Courier New" w:hAnsi="Courier New" w:cs="Courier New" w:hint="default"/>
+      </w:rPr>
+    </w:lvl>
+    <w:lvl w:ilvl="8" w:tplc="04140005" w:tentative="1">
+      <w:start w:val="1"/>
+      <w:numFmt w:val="bullet"/>
+      <w:lvlText w:val=""/>
+      <w:lvlJc w:val="left"/>
+      <w:pPr>
+        <w:ind w:left="6480" w:hanging="360"/>
+      </w:pPr>
+      <w:rPr>
+        <w:rFonts w:ascii="Wingdings" w:hAnsi="Wingdings" w:hint="default"/>
+      </w:rPr>
     </w:lvl>
   </w:abstractNum>
   <w:num w:numId="1" w16cid:durableId="626277093">
@@ -10666,7 +12318,13 @@
     </w:lvlOverride>
   </w:num>
   <w:num w:numId="5" w16cid:durableId="1421222854">
+    <w:abstractNumId w:val="4"/>
+  </w:num>
+  <w:num w:numId="6" w16cid:durableId="582615284">
     <w:abstractNumId w:val="3"/>
+  </w:num>
+  <w:num w:numId="7" w16cid:durableId="2119372988">
+    <w:abstractNumId w:val="5"/>
   </w:num>
 </w:numbering>
 </file>

</xml_diff>